<commit_message>
docs: remove success criteria gate
</commit_message>
<xml_diff>
--- a/docs/기능정의서_기술검토_부록.docx
+++ b/docs/기능정의서_기술검토_부록.docx
@@ -184,7 +184,7 @@
                 <w:color w:val="16243A"/>
                 <w:sz w:val="19"/>
               </w:rPr>
-              <w:t>v1.7 · 2026-08-25</w:t>
+              <w:t>v1.8 · 2026-08-25</w:t>
             </w:r>
           </w:p>
         </w:tc>
@@ -7108,67 +7108,6 @@
           </w:p>
         </w:tc>
       </w:tr>
-      <w:tr>
-        <w:trPr>
-          <w:cantSplit/>
-        </w:trPr>
-        <w:tc>
-          <w:tcPr>
-            <w:tcW w:type="dxa" w:w="2700"/>
-            <w:tcMar>
-              <w:top w:w="80" w:type="dxa"/>
-              <w:start w:w="120" w:type="dxa"/>
-              <w:bottom w:w="80" w:type="dxa"/>
-              <w:end w:w="120" w:type="dxa"/>
-            </w:tcMar>
-            <w:vAlign w:val="center"/>
-          </w:tcPr>
-          <w:p>
-            <w:pPr>
-              <w:spacing w:before="0" w:after="0" w:line="276" w:lineRule="auto"/>
-              <w:jc w:val="left"/>
-            </w:pPr>
-            <w:r/>
-            <w:r>
-              <w:rPr>
-                <w:rFonts w:ascii="Apple SD Gothic Neo" w:hAnsi="Apple SD Gothic Neo" w:eastAsia="Apple SD Gothic Neo"/>
-                <w:b w:val="0"/>
-                <w:color w:val="16243A"/>
-                <w:sz w:val="18"/>
-              </w:rPr>
-              <w:t>제품 성공 기준</w:t>
-            </w:r>
-          </w:p>
-        </w:tc>
-        <w:tc>
-          <w:tcPr>
-            <w:tcW w:type="dxa" w:w="6660"/>
-            <w:tcMar>
-              <w:top w:w="80" w:type="dxa"/>
-              <w:start w:w="120" w:type="dxa"/>
-              <w:bottom w:w="80" w:type="dxa"/>
-              <w:end w:w="120" w:type="dxa"/>
-            </w:tcMar>
-            <w:vAlign w:val="center"/>
-          </w:tcPr>
-          <w:p>
-            <w:pPr>
-              <w:spacing w:before="0" w:after="0" w:line="276" w:lineRule="auto"/>
-              <w:jc w:val="left"/>
-            </w:pPr>
-            <w:r/>
-            <w:r>
-              <w:rPr>
-                <w:rFonts w:ascii="Apple SD Gothic Neo" w:hAnsi="Apple SD Gothic Neo" w:eastAsia="Apple SD Gothic Neo"/>
-                <w:b w:val="0"/>
-                <w:color w:val="16243A"/>
-                <w:sz w:val="18"/>
-              </w:rPr>
-              <w:t>활성화·문서 완성·오류·검토시간·변경대응 KPI와 목표값</w:t>
-            </w:r>
-          </w:p>
-        </w:tc>
-      </w:tr>
     </w:tbl>
     <w:p>
       <w:pPr>
@@ -15348,7 +15287,7 @@
         <w:color w:val="5E6878"/>
         <w:sz w:val="17"/>
       </w:rPr>
-      <w:t>기술검토 부록   ·   FDS-APP-2026-08-v1.7</w:t>
+      <w:t>기술검토 부록   ·   FDS-APP-2026-08-v1.8</w:t>
     </w:r>
   </w:p>
 </w:hdr>

</xml_diff>

<commit_message>
docs: narrow appendix start gates
</commit_message>
<xml_diff>
--- a/docs/기능정의서_기술검토_부록.docx
+++ b/docs/기능정의서_기술검토_부록.docx
@@ -184,7 +184,7 @@
                 <w:color w:val="16243A"/>
                 <w:sz w:val="19"/>
               </w:rPr>
-              <w:t>v1.8 · 2026-08-25</w:t>
+              <w:t>v1.9 · 2026-08-25</w:t>
             </w:r>
           </w:p>
         </w:tc>
@@ -6892,7 +6892,7 @@
                 <w:color w:val="16243A"/>
                 <w:sz w:val="18"/>
               </w:rPr>
-              <w:t>상품·결제</w:t>
+              <w:t>데이터 보유</w:t>
             </w:r>
           </w:p>
         </w:tc>
@@ -6920,190 +6920,7 @@
                 <w:color w:val="16243A"/>
                 <w:sz w:val="18"/>
               </w:rPr>
-              <w:t>플랜·가격·무료 범위·과금 시점·환불·세금·영수증·구독 정책</w:t>
-            </w:r>
-          </w:p>
-        </w:tc>
-      </w:tr>
-      <w:tr>
-        <w:trPr>
-          <w:cantSplit/>
-        </w:trPr>
-        <w:tc>
-          <w:tcPr>
-            <w:tcW w:type="dxa" w:w="2700"/>
-            <w:tcMar>
-              <w:top w:w="80" w:type="dxa"/>
-              <w:start w:w="120" w:type="dxa"/>
-              <w:bottom w:w="80" w:type="dxa"/>
-              <w:end w:w="120" w:type="dxa"/>
-            </w:tcMar>
-            <w:vAlign w:val="center"/>
-          </w:tcPr>
-          <w:p>
-            <w:pPr>
-              <w:spacing w:before="0" w:after="0" w:line="276" w:lineRule="auto"/>
-              <w:jc w:val="left"/>
-            </w:pPr>
-            <w:r/>
-            <w:r>
-              <w:rPr>
-                <w:rFonts w:ascii="Apple SD Gothic Neo" w:hAnsi="Apple SD Gothic Neo" w:eastAsia="Apple SD Gothic Neo"/>
-                <w:b w:val="0"/>
-                <w:color w:val="16243A"/>
-                <w:sz w:val="18"/>
-              </w:rPr>
-              <w:t>외부 변호사 검수</w:t>
-            </w:r>
-          </w:p>
-        </w:tc>
-        <w:tc>
-          <w:tcPr>
-            <w:tcW w:type="dxa" w:w="6660"/>
-            <w:tcMar>
-              <w:top w:w="80" w:type="dxa"/>
-              <w:start w:w="120" w:type="dxa"/>
-              <w:bottom w:w="80" w:type="dxa"/>
-              <w:end w:w="120" w:type="dxa"/>
-            </w:tcMar>
-            <w:vAlign w:val="center"/>
-          </w:tcPr>
-          <w:p>
-            <w:pPr>
-              <w:spacing w:before="0" w:after="0" w:line="276" w:lineRule="auto"/>
-              <w:jc w:val="left"/>
-            </w:pPr>
-            <w:r/>
-            <w:r>
-              <w:rPr>
-                <w:rFonts w:ascii="Apple SD Gothic Neo" w:hAnsi="Apple SD Gothic Neo" w:eastAsia="Apple SD Gothic Neo"/>
-                <w:b w:val="0"/>
-                <w:color w:val="16243A"/>
-                <w:sz w:val="18"/>
-              </w:rPr>
-              <w:t>관할·자격·배정·NDA·이해상충·책임·SLA·재검수·환불 계약</w:t>
-            </w:r>
-          </w:p>
-        </w:tc>
-      </w:tr>
-      <w:tr>
-        <w:trPr>
-          <w:cantSplit/>
-        </w:trPr>
-        <w:tc>
-          <w:tcPr>
-            <w:tcW w:type="dxa" w:w="2700"/>
-            <w:tcMar>
-              <w:top w:w="80" w:type="dxa"/>
-              <w:start w:w="120" w:type="dxa"/>
-              <w:bottom w:w="80" w:type="dxa"/>
-              <w:end w:w="120" w:type="dxa"/>
-            </w:tcMar>
-            <w:vAlign w:val="center"/>
-          </w:tcPr>
-          <w:p>
-            <w:pPr>
-              <w:spacing w:before="0" w:after="0" w:line="276" w:lineRule="auto"/>
-              <w:jc w:val="left"/>
-            </w:pPr>
-            <w:r/>
-            <w:r>
-              <w:rPr>
-                <w:rFonts w:ascii="Apple SD Gothic Neo" w:hAnsi="Apple SD Gothic Neo" w:eastAsia="Apple SD Gothic Neo"/>
-                <w:b w:val="0"/>
-                <w:color w:val="16243A"/>
-                <w:sz w:val="18"/>
-              </w:rPr>
-              <w:t>데이터 보유</w:t>
-            </w:r>
-          </w:p>
-        </w:tc>
-        <w:tc>
-          <w:tcPr>
-            <w:tcW w:type="dxa" w:w="6660"/>
-            <w:tcMar>
-              <w:top w:w="80" w:type="dxa"/>
-              <w:start w:w="120" w:type="dxa"/>
-              <w:bottom w:w="80" w:type="dxa"/>
-              <w:end w:w="120" w:type="dxa"/>
-            </w:tcMar>
-            <w:vAlign w:val="center"/>
-          </w:tcPr>
-          <w:p>
-            <w:pPr>
-              <w:spacing w:before="0" w:after="0" w:line="276" w:lineRule="auto"/>
-              <w:jc w:val="left"/>
-            </w:pPr>
-            <w:r/>
-            <w:r>
-              <w:rPr>
-                <w:rFonts w:ascii="Apple SD Gothic Neo" w:hAnsi="Apple SD Gothic Neo" w:eastAsia="Apple SD Gothic Neo"/>
-                <w:b w:val="0"/>
-                <w:color w:val="16243A"/>
-                <w:sz w:val="18"/>
-              </w:rPr>
               <w:t>원본·추출·원장·문서·감사·백업별 기간과 삭제 예외</w:t>
-            </w:r>
-          </w:p>
-        </w:tc>
-      </w:tr>
-      <w:tr>
-        <w:trPr>
-          <w:cantSplit/>
-        </w:trPr>
-        <w:tc>
-          <w:tcPr>
-            <w:tcW w:type="dxa" w:w="2700"/>
-            <w:tcMar>
-              <w:top w:w="80" w:type="dxa"/>
-              <w:start w:w="120" w:type="dxa"/>
-              <w:bottom w:w="80" w:type="dxa"/>
-              <w:end w:w="120" w:type="dxa"/>
-            </w:tcMar>
-            <w:vAlign w:val="center"/>
-          </w:tcPr>
-          <w:p>
-            <w:pPr>
-              <w:spacing w:before="0" w:after="0" w:line="276" w:lineRule="auto"/>
-              <w:jc w:val="left"/>
-            </w:pPr>
-            <w:r/>
-            <w:r>
-              <w:rPr>
-                <w:rFonts w:ascii="Apple SD Gothic Neo" w:hAnsi="Apple SD Gothic Neo" w:eastAsia="Apple SD Gothic Neo"/>
-                <w:b w:val="0"/>
-                <w:color w:val="16243A"/>
-                <w:sz w:val="18"/>
-              </w:rPr>
-              <w:t>알림·재동의</w:t>
-            </w:r>
-          </w:p>
-        </w:tc>
-        <w:tc>
-          <w:tcPr>
-            <w:tcW w:type="dxa" w:w="6660"/>
-            <w:tcMar>
-              <w:top w:w="80" w:type="dxa"/>
-              <w:start w:w="120" w:type="dxa"/>
-              <w:bottom w:w="80" w:type="dxa"/>
-              <w:end w:w="120" w:type="dxa"/>
-            </w:tcMar>
-            <w:vAlign w:val="center"/>
-          </w:tcPr>
-          <w:p>
-            <w:pPr>
-              <w:spacing w:before="0" w:after="0" w:line="276" w:lineRule="auto"/>
-              <w:jc w:val="left"/>
-            </w:pPr>
-            <w:r/>
-            <w:r>
-              <w:rPr>
-                <w:rFonts w:ascii="Apple SD Gothic Neo" w:hAnsi="Apple SD Gothic Neo" w:eastAsia="Apple SD Gothic Neo"/>
-                <w:b w:val="0"/>
-                <w:color w:val="16243A"/>
-                <w:sz w:val="18"/>
-              </w:rPr>
-              <w:t>채널·수신 동의·중요 변경 기준·재동의 정책</w:t>
             </w:r>
           </w:p>
         </w:tc>
@@ -15287,7 +15104,7 @@
         <w:color w:val="5E6878"/>
         <w:sz w:val="17"/>
       </w:rPr>
-      <w:t>기술검토 부록   ·   FDS-APP-2026-08-v1.8</w:t>
+      <w:t>기술검토 부록   ·   FDS-APP-2026-08-v1.9</w:t>
     </w:r>
   </w:p>
 </w:hdr>

</xml_diff>

<commit_message>
docs: remove external reviewer product role
</commit_message>
<xml_diff>
--- a/docs/기능정의서_기술검토_부록.docx
+++ b/docs/기능정의서_기술검토_부록.docx
@@ -184,7 +184,7 @@
                 <w:color w:val="16243A"/>
                 <w:sz w:val="19"/>
               </w:rPr>
-              <w:t>v1.9 · 2026-08-25</w:t>
+              <w:t>v1.10 · 2026-08-25</w:t>
             </w:r>
           </w:p>
         </w:tc>
@@ -878,95 +878,6 @@
                 <w:sz w:val="18"/>
               </w:rPr>
               <w:t>법률 자격을 전제로 하지 않고 의견 범위를 표시</w:t>
-            </w:r>
-          </w:p>
-        </w:tc>
-      </w:tr>
-      <w:tr>
-        <w:trPr>
-          <w:cantSplit/>
-        </w:trPr>
-        <w:tc>
-          <w:tcPr>
-            <w:tcW w:type="dxa" w:w="1500"/>
-            <w:tcMar>
-              <w:top w:w="80" w:type="dxa"/>
-              <w:start w:w="120" w:type="dxa"/>
-              <w:bottom w:w="80" w:type="dxa"/>
-              <w:end w:w="120" w:type="dxa"/>
-            </w:tcMar>
-            <w:vAlign w:val="center"/>
-          </w:tcPr>
-          <w:p>
-            <w:pPr>
-              <w:spacing w:before="0" w:after="0" w:line="276" w:lineRule="auto"/>
-              <w:jc w:val="left"/>
-            </w:pPr>
-            <w:r/>
-            <w:r>
-              <w:rPr>
-                <w:rFonts w:ascii="Apple SD Gothic Neo" w:hAnsi="Apple SD Gothic Neo" w:eastAsia="Apple SD Gothic Neo"/>
-                <w:b/>
-                <w:color w:val="16243A"/>
-                <w:sz w:val="18"/>
-              </w:rPr>
-              <w:t>외부 법률 검토자</w:t>
-            </w:r>
-          </w:p>
-        </w:tc>
-        <w:tc>
-          <w:tcPr>
-            <w:tcW w:type="dxa" w:w="4450"/>
-            <w:tcMar>
-              <w:top w:w="80" w:type="dxa"/>
-              <w:start w:w="120" w:type="dxa"/>
-              <w:bottom w:w="80" w:type="dxa"/>
-              <w:end w:w="120" w:type="dxa"/>
-            </w:tcMar>
-            <w:vAlign w:val="center"/>
-          </w:tcPr>
-          <w:p>
-            <w:pPr>
-              <w:spacing w:before="0" w:after="0" w:line="276" w:lineRule="auto"/>
-              <w:jc w:val="left"/>
-            </w:pPr>
-            <w:r/>
-            <w:r>
-              <w:rPr>
-                <w:rFonts w:ascii="Apple SD Gothic Neo" w:hAnsi="Apple SD Gothic Neo" w:eastAsia="Apple SD Gothic Neo"/>
-                <w:b w:val="0"/>
-                <w:color w:val="16243A"/>
-                <w:sz w:val="18"/>
-              </w:rPr>
-              <w:t>정해진 관할·범위·기준일의 법률 검수</w:t>
-            </w:r>
-          </w:p>
-        </w:tc>
-        <w:tc>
-          <w:tcPr>
-            <w:tcW w:type="dxa" w:w="3410"/>
-            <w:tcMar>
-              <w:top w:w="80" w:type="dxa"/>
-              <w:start w:w="120" w:type="dxa"/>
-              <w:bottom w:w="80" w:type="dxa"/>
-              <w:end w:w="120" w:type="dxa"/>
-            </w:tcMar>
-            <w:vAlign w:val="center"/>
-          </w:tcPr>
-          <w:p>
-            <w:pPr>
-              <w:spacing w:before="0" w:after="0" w:line="276" w:lineRule="auto"/>
-              <w:jc w:val="left"/>
-            </w:pPr>
-            <w:r/>
-            <w:r>
-              <w:rPr>
-                <w:rFonts w:ascii="Apple SD Gothic Neo" w:hAnsi="Apple SD Gothic Neo" w:eastAsia="Apple SD Gothic Neo"/>
-                <w:b w:val="0"/>
-                <w:color w:val="16243A"/>
-                <w:sz w:val="18"/>
-              </w:rPr>
-              <w:t>자격·계약·NDA·제외 범위 확인 후 접근</w:t>
             </w:r>
           </w:p>
         </w:tc>
@@ -15104,7 +15015,7 @@
         <w:color w:val="5E6878"/>
         <w:sz w:val="17"/>
       </w:rPr>
-      <w:t>기술검토 부록   ·   FDS-APP-2026-08-v1.9</w:t>
+      <w:t>기술검토 부록   ·   FDS-APP-2026-08-v1.10</w:t>
     </w:r>
   </w:p>
 </w:hdr>

</xml_diff>

<commit_message>
docs: remove general reviewer product role
</commit_message>
<xml_diff>
--- a/docs/기능정의서_기술검토_부록.docx
+++ b/docs/기능정의서_기술검토_부록.docx
@@ -184,7 +184,7 @@
                 <w:color w:val="16243A"/>
                 <w:sz w:val="19"/>
               </w:rPr>
-              <w:t>v1.11 · 2026-08-25</w:t>
+              <w:t>v1.12 · 2026-08-25</w:t>
             </w:r>
           </w:p>
         </w:tc>
@@ -789,95 +789,6 @@
                 <w:sz w:val="18"/>
               </w:rPr>
               <w:t>법적 의미 판단 또는 변호사 검수로 자동 간주하지 않음</w:t>
-            </w:r>
-          </w:p>
-        </w:tc>
-      </w:tr>
-      <w:tr>
-        <w:trPr>
-          <w:cantSplit/>
-        </w:trPr>
-        <w:tc>
-          <w:tcPr>
-            <w:tcW w:type="dxa" w:w="1500"/>
-            <w:tcMar>
-              <w:top w:w="80" w:type="dxa"/>
-              <w:start w:w="120" w:type="dxa"/>
-              <w:bottom w:w="80" w:type="dxa"/>
-              <w:end w:w="120" w:type="dxa"/>
-            </w:tcMar>
-            <w:vAlign w:val="center"/>
-          </w:tcPr>
-          <w:p>
-            <w:pPr>
-              <w:spacing w:before="0" w:after="0" w:line="276" w:lineRule="auto"/>
-              <w:jc w:val="left"/>
-            </w:pPr>
-            <w:r/>
-            <w:r>
-              <w:rPr>
-                <w:rFonts w:ascii="Apple SD Gothic Neo" w:hAnsi="Apple SD Gothic Neo" w:eastAsia="Apple SD Gothic Neo"/>
-                <w:b/>
-                <w:color w:val="16243A"/>
-                <w:sz w:val="18"/>
-              </w:rPr>
-              <w:t>일반 검토자</w:t>
-            </w:r>
-          </w:p>
-        </w:tc>
-        <w:tc>
-          <w:tcPr>
-            <w:tcW w:type="dxa" w:w="4450"/>
-            <w:tcMar>
-              <w:top w:w="80" w:type="dxa"/>
-              <w:start w:w="120" w:type="dxa"/>
-              <w:bottom w:w="80" w:type="dxa"/>
-              <w:end w:w="120" w:type="dxa"/>
-            </w:tcMar>
-            <w:vAlign w:val="center"/>
-          </w:tcPr>
-          <w:p>
-            <w:pPr>
-              <w:spacing w:before="0" w:after="0" w:line="276" w:lineRule="auto"/>
-              <w:jc w:val="left"/>
-            </w:pPr>
-            <w:r/>
-            <w:r>
-              <w:rPr>
-                <w:rFonts w:ascii="Apple SD Gothic Neo" w:hAnsi="Apple SD Gothic Neo" w:eastAsia="Apple SD Gothic Neo"/>
-                <w:b w:val="0"/>
-                <w:color w:val="16243A"/>
-                <w:sz w:val="18"/>
-              </w:rPr>
-              <w:t>누락·표현·문서 간 일관성 검토</w:t>
-            </w:r>
-          </w:p>
-        </w:tc>
-        <w:tc>
-          <w:tcPr>
-            <w:tcW w:type="dxa" w:w="3410"/>
-            <w:tcMar>
-              <w:top w:w="80" w:type="dxa"/>
-              <w:start w:w="120" w:type="dxa"/>
-              <w:bottom w:w="80" w:type="dxa"/>
-              <w:end w:w="120" w:type="dxa"/>
-            </w:tcMar>
-            <w:vAlign w:val="center"/>
-          </w:tcPr>
-          <w:p>
-            <w:pPr>
-              <w:spacing w:before="0" w:after="0" w:line="276" w:lineRule="auto"/>
-              <w:jc w:val="left"/>
-            </w:pPr>
-            <w:r/>
-            <w:r>
-              <w:rPr>
-                <w:rFonts w:ascii="Apple SD Gothic Neo" w:hAnsi="Apple SD Gothic Neo" w:eastAsia="Apple SD Gothic Neo"/>
-                <w:b w:val="0"/>
-                <w:color w:val="16243A"/>
-                <w:sz w:val="18"/>
-              </w:rPr>
-              <w:t>법률 자격을 전제로 하지 않고 의견 범위를 표시</w:t>
             </w:r>
           </w:p>
         </w:tc>
@@ -15015,7 +14926,7 @@
         <w:color w:val="5E6878"/>
         <w:sz w:val="17"/>
       </w:rPr>
-      <w:t>기술검토 부록   ·   FDS-APP-2026-08-v1.11</w:t>
+      <w:t>기술검토 부록   ·   FDS-APP-2026-08-v1.12</w:t>
     </w:r>
   </w:p>
 </w:hdr>

</xml_diff>

<commit_message>
docs: remove deferred review acceptance test
</commit_message>
<xml_diff>
--- a/docs/기능정의서_기술검토_부록.docx
+++ b/docs/기능정의서_기술검토_부록.docx
@@ -184,7 +184,7 @@
                 <w:color w:val="16243A"/>
                 <w:sz w:val="19"/>
               </w:rPr>
-              <w:t>v1.12 · 2026-08-25</w:t>
+              <w:t>v1.13 · 2026-08-25</w:t>
             </w:r>
           </w:p>
         </w:tc>
@@ -4026,24 +4026,6 @@
           <w:sz w:val="21"/>
         </w:rPr>
         <w:t>사람이 새 규칙·조항을 승인해도 고객 승인 전에는 현재 공개 문서가 유지된다.</w:t>
-      </w:r>
-    </w:p>
-    <w:p>
-      <w:pPr>
-        <w:numPr>
-          <w:ilvl w:val="0"/>
-          <w:numId w:val="11"/>
-        </w:numPr>
-        <w:spacing w:after="100" w:line="300" w:lineRule="auto"/>
-        <w:ind w:left="540" w:hanging="271"/>
-      </w:pPr>
-      <w:r>
-        <w:rPr>
-          <w:rFonts w:ascii="Apple SD Gothic Neo" w:hAnsi="Apple SD Gothic Neo" w:eastAsia="Apple SD Gothic Neo"/>
-          <w:color w:val="16243A"/>
-          <w:sz w:val="21"/>
-        </w:rPr>
-        <w:t>일반 검토와 변호사 검수는 화면·데이터·감사 로그에서 구분된다.</w:t>
       </w:r>
     </w:p>
     <w:p>
@@ -14926,7 +14908,7 @@
         <w:color w:val="5E6878"/>
         <w:sz w:val="17"/>
       </w:rPr>
-      <w:t>기술검토 부록   ·   FDS-APP-2026-08-v1.12</w:t>
+      <w:t>기술검토 부록   ·   FDS-APP-2026-08-v1.13</w:t>
     </w:r>
   </w:p>
 </w:hdr>

</xml_diff>

<commit_message>
docs: refine product and technical specifications
</commit_message>
<xml_diff>
--- a/docs/기능정의서_기술검토_부록.docx
+++ b/docs/기능정의서_기술검토_부록.docx
@@ -176,15 +176,8 @@
               <w:spacing w:before="0" w:after="0" w:line="276" w:lineRule="auto"/>
               <w:jc w:val="left"/>
             </w:pPr>
-            <w:r/>
-            <w:r>
-              <w:rPr>
-                <w:rFonts w:ascii="Apple SD Gothic Neo" w:hAnsi="Apple SD Gothic Neo" w:eastAsia="Apple SD Gothic Neo"/>
-                <w:b w:val="0"/>
-                <w:color w:val="16243A"/>
-                <w:sz w:val="19"/>
-              </w:rPr>
-              <w:t>v1.13 · 2026-08-25</w:t>
+            <w:r>
+              <w:t>v1.14 · 2026-08-25</w:t>
             </w:r>
           </w:p>
         </w:tc>
@@ -237,15 +230,8 @@
               <w:spacing w:before="0" w:after="0" w:line="276" w:lineRule="auto"/>
               <w:jc w:val="left"/>
             </w:pPr>
-            <w:r/>
-            <w:r>
-              <w:rPr>
-                <w:rFonts w:ascii="Apple SD Gothic Neo" w:hAnsi="Apple SD Gothic Neo" w:eastAsia="Apple SD Gothic Neo"/>
-                <w:b w:val="0"/>
-                <w:color w:val="16243A"/>
-                <w:sz w:val="19"/>
-              </w:rPr>
-              <w:t>글로벌 개인정보 문서 서비스 기능정의서 v2.8</w:t>
+            <w:r>
+              <w:t>글로벌 개인정보 문서 서비스 기능정의서 v2.9</w:t>
             </w:r>
           </w:p>
         </w:tc>
@@ -1763,15 +1749,8 @@
               <w:spacing w:before="0" w:after="0" w:line="276" w:lineRule="auto"/>
               <w:jc w:val="left"/>
             </w:pPr>
-            <w:r/>
-            <w:r>
-              <w:rPr>
-                <w:rFonts w:ascii="Apple SD Gothic Neo" w:hAnsi="Apple SD Gothic Neo" w:eastAsia="Apple SD Gothic Neo"/>
-                <w:b w:val="0"/>
-                <w:color w:val="16243A"/>
-                <w:sz w:val="17"/>
-              </w:rPr>
-              <w:t>사용자 지정 개별 URL·문서·공급업체 등 입력 자료</w:t>
+            <w:r>
+              <w:t>사용자가 지정한 개별 URL·문서·원문·공급업체 입력 자료. URL은 입력한 페이지 하나만 대상으로 하며 자동 크롤링하지 않음</w:t>
             </w:r>
           </w:p>
         </w:tc>
@@ -1791,15 +1770,8 @@
               <w:spacing w:before="0" w:after="0" w:line="276" w:lineRule="auto"/>
               <w:jc w:val="left"/>
             </w:pPr>
-            <w:r/>
-            <w:r>
-              <w:rPr>
-                <w:rFonts w:ascii="Apple SD Gothic Neo" w:hAnsi="Apple SD Gothic Neo" w:eastAsia="Apple SD Gothic Neo"/>
-                <w:b w:val="0"/>
-                <w:color w:val="16243A"/>
-                <w:sz w:val="17"/>
-              </w:rPr>
-              <w:t>source_id · content_hash · safety_status</w:t>
+            <w:r>
+              <w:t>source_id · content_hash · safety_status · detector_version</w:t>
             </w:r>
           </w:p>
         </w:tc>
@@ -2030,15 +2002,8 @@
               <w:spacing w:before="0" w:after="0" w:line="276" w:lineRule="auto"/>
               <w:jc w:val="left"/>
             </w:pPr>
-            <w:r/>
-            <w:r>
-              <w:rPr>
-                <w:rFonts w:ascii="Apple SD Gothic Neo" w:hAnsi="Apple SD Gothic Neo" w:eastAsia="Apple SD Gothic Neo"/>
-                <w:b w:val="0"/>
-                <w:color w:val="16243A"/>
-                <w:sz w:val="17"/>
-              </w:rPr>
-              <w:t>관할별 승인 규칙·조항</w:t>
+            <w:r>
+              <w:t>관할별 법률 검토를 거쳐 승인·활성화된 규칙·조항 버전. 새로 수집한 출처 스냅샷과 별도 상태로 관리</w:t>
             </w:r>
           </w:p>
         </w:tc>
@@ -2058,15 +2023,8 @@
               <w:spacing w:before="0" w:after="0" w:line="276" w:lineRule="auto"/>
               <w:jc w:val="left"/>
             </w:pPr>
-            <w:r/>
-            <w:r>
-              <w:rPr>
-                <w:rFonts w:ascii="Apple SD Gothic Neo" w:hAnsi="Apple SD Gothic Neo" w:eastAsia="Apple SD Gothic Neo"/>
-                <w:b w:val="0"/>
-                <w:color w:val="16243A"/>
-                <w:sz w:val="17"/>
-              </w:rPr>
-              <w:t>jurisdiction · version · legal_as_of · source_snapshot_id · approval</w:t>
+            <w:r>
+              <w:t>jurisdiction · version · legal_as_of · source_snapshot_ids · reviewer · approval · activation</w:t>
             </w:r>
           </w:p>
         </w:tc>
@@ -2208,15 +2166,8 @@
               <w:spacing w:before="0" w:after="0" w:line="276" w:lineRule="auto"/>
               <w:jc w:val="left"/>
             </w:pPr>
-            <w:r/>
-            <w:r>
-              <w:rPr>
-                <w:rFonts w:ascii="Apple SD Gothic Neo" w:hAnsi="Apple SD Gothic Neo" w:eastAsia="Apple SD Gothic Neo"/>
-                <w:b w:val="0"/>
-                <w:color w:val="16243A"/>
-                <w:sz w:val="17"/>
-              </w:rPr>
-              <w:t>특정 사실·공식 출처·규칙·조항으로 만든 불변 버전</w:t>
+            <w:r>
+              <w:t>특정 사실 리비전·활성 RuleSet·Clause·승인 근거 스냅샷으로 만든 불변 국가별 문서 버전</w:t>
             </w:r>
           </w:p>
         </w:tc>
@@ -2236,15 +2187,8 @@
               <w:spacing w:before="0" w:after="0" w:line="276" w:lineRule="auto"/>
               <w:jc w:val="left"/>
             </w:pPr>
-            <w:r/>
-            <w:r>
-              <w:rPr>
-                <w:rFonts w:ascii="Apple SD Gothic Neo" w:hAnsi="Apple SD Gothic Neo" w:eastAsia="Apple SD Gothic Neo"/>
-                <w:b w:val="0"/>
-                <w:color w:val="16243A"/>
-                <w:sz w:val="17"/>
-              </w:rPr>
-              <w:t>version · source_snapshot_ids · content_hash · effective_at</w:t>
+            <w:r>
+              <w:t>version · fact_revision_id · ruleset_version · source_snapshot_ids · content_hash · effective_at</w:t>
             </w:r>
           </w:p>
         </w:tc>
@@ -2297,15 +2241,8 @@
               <w:spacing w:before="0" w:after="0" w:line="276" w:lineRule="auto"/>
               <w:jc w:val="left"/>
             </w:pPr>
-            <w:r/>
-            <w:r>
-              <w:rPr>
-                <w:rFonts w:ascii="Apple SD Gothic Neo" w:hAnsi="Apple SD Gothic Neo" w:eastAsia="Apple SD Gothic Neo"/>
-                <w:b w:val="0"/>
-                <w:color w:val="16243A"/>
-                <w:sz w:val="17"/>
-              </w:rPr>
-              <w:t>문서 작성·재작성 시 조회한 공식 법령·지침 공개본</w:t>
+            <w:r>
+              <w:t>작성·재작성 시 조회한 공식 법령·지침 공개본의 불변 수집 증거. 수집 완료만으로 법률 콘텐츠 승인으로 간주하지 않음</w:t>
             </w:r>
           </w:p>
         </w:tc>
@@ -2325,15 +2262,8 @@
               <w:spacing w:before="0" w:after="0" w:line="276" w:lineRule="auto"/>
               <w:jc w:val="left"/>
             </w:pPr>
-            <w:r/>
-            <w:r>
-              <w:rPr>
-                <w:rFonts w:ascii="Apple SD Gothic Neo" w:hAnsi="Apple SD Gothic Neo" w:eastAsia="Apple SD Gothic Neo"/>
-                <w:b w:val="0"/>
-                <w:color w:val="16243A"/>
-                <w:sz w:val="17"/>
-              </w:rPr>
-              <w:t>url · fetched_at · hash · legal_as_of · rights_status</w:t>
+            <w:r>
+              <w:t>url · fetched_at · hash · legal_as_of · rights_status · comparison_status</w:t>
             </w:r>
           </w:p>
         </w:tc>
@@ -2386,15 +2316,8 @@
               <w:spacing w:before="0" w:after="0" w:line="276" w:lineRule="auto"/>
               <w:jc w:val="left"/>
             </w:pPr>
-            <w:r/>
-            <w:r>
-              <w:rPr>
-                <w:rFonts w:ascii="Apple SD Gothic Neo" w:hAnsi="Apple SD Gothic Neo" w:eastAsia="Apple SD Gothic Neo"/>
-                <w:b w:val="0"/>
-                <w:color w:val="16243A"/>
-                <w:sz w:val="17"/>
-              </w:rPr>
-              <w:t>출처 변경의 사람 판단과 영향</w:t>
+            <w:r>
+              <w:t>공식 출처 차이에 대한 사람의 법적 의미·영향 판단과 새 RuleSet·Clause 승인 결정</w:t>
             </w:r>
           </w:p>
         </w:tc>
@@ -2414,15 +2337,8 @@
               <w:spacing w:before="0" w:after="0" w:line="276" w:lineRule="auto"/>
               <w:jc w:val="left"/>
             </w:pPr>
-            <w:r/>
-            <w:r>
-              <w:rPr>
-                <w:rFonts w:ascii="Apple SD Gothic Neo" w:hAnsi="Apple SD Gothic Neo" w:eastAsia="Apple SD Gothic Neo"/>
-                <w:b w:val="0"/>
-                <w:color w:val="16243A"/>
-                <w:sz w:val="17"/>
-              </w:rPr>
-              <w:t>review_id · reviewer · decision · evidence</w:t>
+            <w:r>
+              <w:t>review_id · snapshot_id · reviewer · decision · evidence · decided_at</w:t>
             </w:r>
           </w:p>
         </w:tc>
@@ -2656,14 +2572,7 @@
               <w:spacing w:before="0" w:after="0" w:line="276" w:lineRule="auto"/>
               <w:jc w:val="left"/>
             </w:pPr>
-            <w:r/>
-            <w:r>
-              <w:rPr>
-                <w:rFonts w:ascii="Apple SD Gothic Neo" w:hAnsi="Apple SD Gothic Neo" w:eastAsia="Apple SD Gothic Neo"/>
-                <w:b/>
-                <w:color w:val="16243A"/>
-                <w:sz w:val="18"/>
-              </w:rPr>
+            <w:r>
               <w:t>대상</w:t>
             </w:r>
           </w:p>
@@ -2686,14 +2595,7 @@
               <w:spacing w:before="0" w:after="0" w:line="276" w:lineRule="auto"/>
               <w:jc w:val="left"/>
             </w:pPr>
-            <w:r/>
-            <w:r>
-              <w:rPr>
-                <w:rFonts w:ascii="Apple SD Gothic Neo" w:hAnsi="Apple SD Gothic Neo" w:eastAsia="Apple SD Gothic Neo"/>
-                <w:b/>
-                <w:color w:val="16243A"/>
-                <w:sz w:val="18"/>
-              </w:rPr>
+            <w:r>
               <w:t>허용 상태</w:t>
             </w:r>
           </w:p>
@@ -2716,14 +2618,7 @@
               <w:spacing w:before="0" w:after="0" w:line="276" w:lineRule="auto"/>
               <w:jc w:val="left"/>
             </w:pPr>
-            <w:r/>
-            <w:r>
-              <w:rPr>
-                <w:rFonts w:ascii="Apple SD Gothic Neo" w:hAnsi="Apple SD Gothic Neo" w:eastAsia="Apple SD Gothic Neo"/>
-                <w:b/>
-                <w:color w:val="16243A"/>
-                <w:sz w:val="18"/>
-              </w:rPr>
+            <w:r>
               <w:t>핵심 전이 규칙</w:t>
             </w:r>
           </w:p>
@@ -2749,14 +2644,7 @@
               <w:spacing w:before="0" w:after="0" w:line="276" w:lineRule="auto"/>
               <w:jc w:val="left"/>
             </w:pPr>
-            <w:r/>
-            <w:r>
-              <w:rPr>
-                <w:rFonts w:ascii="Apple SD Gothic Neo" w:hAnsi="Apple SD Gothic Neo" w:eastAsia="Apple SD Gothic Neo"/>
-                <w:b/>
-                <w:color w:val="16243A"/>
-                <w:sz w:val="18"/>
-              </w:rPr>
+            <w:r>
               <w:t>자료</w:t>
             </w:r>
           </w:p>
@@ -2777,14 +2665,7 @@
               <w:spacing w:before="0" w:after="0" w:line="276" w:lineRule="auto"/>
               <w:jc w:val="left"/>
             </w:pPr>
-            <w:r/>
-            <w:r>
-              <w:rPr>
-                <w:rFonts w:ascii="Apple SD Gothic Neo" w:hAnsi="Apple SD Gothic Neo" w:eastAsia="Apple SD Gothic Neo"/>
-                <w:b w:val="0"/>
-                <w:color w:val="16243A"/>
-                <w:sz w:val="18"/>
-              </w:rPr>
+            <w:r>
               <w:t>등록 → 검사중 → 차단/안전 → 파싱중 → 분석완료/실패 → 삭제</w:t>
             </w:r>
           </w:p>
@@ -2805,15 +2686,8 @@
               <w:spacing w:before="0" w:after="0" w:line="276" w:lineRule="auto"/>
               <w:jc w:val="left"/>
             </w:pPr>
-            <w:r/>
-            <w:r>
-              <w:rPr>
-                <w:rFonts w:ascii="Apple SD Gothic Neo" w:hAnsi="Apple SD Gothic Neo" w:eastAsia="Apple SD Gothic Neo"/>
-                <w:b w:val="0"/>
-                <w:color w:val="16243A"/>
-                <w:sz w:val="18"/>
-              </w:rPr>
-              <w:t>차단 자료는 외부 분석으로 전달하지 않음</w:t>
+            <w:r>
+              <w:t>악성 파일 또는 실제 개인정보·비밀정보 후보가 있는 자료는 외부 분석으로 전달하지 않고 수정·삭제 후 재검사</w:t>
             </w:r>
           </w:p>
         </w:tc>
@@ -2838,14 +2712,7 @@
               <w:spacing w:before="0" w:after="0" w:line="276" w:lineRule="auto"/>
               <w:jc w:val="left"/>
             </w:pPr>
-            <w:r/>
-            <w:r>
-              <w:rPr>
-                <w:rFonts w:ascii="Apple SD Gothic Neo" w:hAnsi="Apple SD Gothic Neo" w:eastAsia="Apple SD Gothic Neo"/>
-                <w:b/>
-                <w:color w:val="16243A"/>
-                <w:sz w:val="18"/>
-              </w:rPr>
+            <w:r>
               <w:t>사실 후보</w:t>
             </w:r>
           </w:p>
@@ -2866,15 +2733,8 @@
               <w:spacing w:before="0" w:after="0" w:line="276" w:lineRule="auto"/>
               <w:jc w:val="left"/>
             </w:pPr>
-            <w:r/>
-            <w:r>
-              <w:rPr>
-                <w:rFonts w:ascii="Apple SD Gothic Neo" w:hAnsi="Apple SD Gothic Neo" w:eastAsia="Apple SD Gothic Neo"/>
-                <w:b w:val="0"/>
-                <w:color w:val="16243A"/>
-                <w:sz w:val="18"/>
-              </w:rPr>
-              <w:t>제안 → 확인 필요 → 확인/수정/해당 없음 → 변경 후보</w:t>
+            <w:r>
+              <w:t>제안 → 확인 필요 → 확인/수정/해당 없음/보류 → 변경 후보</w:t>
             </w:r>
           </w:p>
         </w:tc>
@@ -2894,15 +2754,8 @@
               <w:spacing w:before="0" w:after="0" w:line="276" w:lineRule="auto"/>
               <w:jc w:val="left"/>
             </w:pPr>
-            <w:r/>
-            <w:r>
-              <w:rPr>
-                <w:rFonts w:ascii="Apple SD Gothic Neo" w:hAnsi="Apple SD Gothic Neo" w:eastAsia="Apple SD Gothic Neo"/>
-                <w:b w:val="0"/>
-                <w:color w:val="16243A"/>
-                <w:sz w:val="18"/>
-              </w:rPr>
-              <w:t>확인 필요 값은 확정 원장·공개 문서에 반영하지 않음</w:t>
+            <w:r>
+              <w:t>보류·확인 필요 값은 확정 사실 리비전과 공개 문서에 반영하지 않음</w:t>
             </w:r>
           </w:p>
         </w:tc>
@@ -2927,14 +2780,7 @@
               <w:spacing w:before="0" w:after="0" w:line="276" w:lineRule="auto"/>
               <w:jc w:val="left"/>
             </w:pPr>
-            <w:r/>
-            <w:r>
-              <w:rPr>
-                <w:rFonts w:ascii="Apple SD Gothic Neo" w:hAnsi="Apple SD Gothic Neo" w:eastAsia="Apple SD Gothic Neo"/>
-                <w:b/>
-                <w:color w:val="16243A"/>
-                <w:sz w:val="18"/>
-              </w:rPr>
+            <w:r>
               <w:t>문서</w:t>
             </w:r>
           </w:p>
@@ -2955,14 +2801,7 @@
               <w:spacing w:before="0" w:after="0" w:line="276" w:lineRule="auto"/>
               <w:jc w:val="left"/>
             </w:pPr>
-            <w:r/>
-            <w:r>
-              <w:rPr>
-                <w:rFonts w:ascii="Apple SD Gothic Neo" w:hAnsi="Apple SD Gothic Neo" w:eastAsia="Apple SD Gothic Neo"/>
-                <w:b w:val="0"/>
-                <w:color w:val="16243A"/>
-                <w:sz w:val="18"/>
-              </w:rPr>
+            <w:r>
               <w:t>초안 → 차단/검토 가능 → 승인 대기 → 승인 → 발행 → 대체/중단</w:t>
             </w:r>
           </w:p>
@@ -2983,15 +2822,8 @@
               <w:spacing w:before="0" w:after="0" w:line="276" w:lineRule="auto"/>
               <w:jc w:val="left"/>
             </w:pPr>
-            <w:r/>
-            <w:r>
-              <w:rPr>
-                <w:rFonts w:ascii="Apple SD Gothic Neo" w:hAnsi="Apple SD Gothic Neo" w:eastAsia="Apple SD Gothic Neo"/>
-                <w:b w:val="0"/>
-                <w:color w:val="16243A"/>
-                <w:sz w:val="18"/>
-              </w:rPr>
-              <w:t>차단·미승인 상태에서 공개 발행 불가</w:t>
+            <w:r>
+              <w:t>차단·미승인 상태에서 공개 발행할 수 없고 기존 발행본을 덮어쓰지 않음</w:t>
             </w:r>
           </w:p>
         </w:tc>
@@ -3016,15 +2848,8 @@
               <w:spacing w:before="0" w:after="0" w:line="276" w:lineRule="auto"/>
               <w:jc w:val="left"/>
             </w:pPr>
-            <w:r/>
-            <w:r>
-              <w:rPr>
-                <w:rFonts w:ascii="Apple SD Gothic Neo" w:hAnsi="Apple SD Gothic Neo" w:eastAsia="Apple SD Gothic Neo"/>
-                <w:b/>
-                <w:color w:val="16243A"/>
-                <w:sz w:val="18"/>
-              </w:rPr>
-              <w:t>법률 출처</w:t>
+            <w:r>
+              <w:t>공식 출처</w:t>
             </w:r>
           </w:p>
         </w:tc>
@@ -3044,15 +2869,8 @@
               <w:spacing w:before="0" w:after="0" w:line="276" w:lineRule="auto"/>
               <w:jc w:val="left"/>
             </w:pPr>
-            <w:r/>
-            <w:r>
-              <w:rPr>
-                <w:rFonts w:ascii="Apple SD Gothic Neo" w:hAnsi="Apple SD Gothic Neo" w:eastAsia="Apple SD Gothic Neo"/>
-                <w:b w:val="0"/>
-                <w:color w:val="16243A"/>
-                <w:sz w:val="18"/>
-              </w:rPr>
-              <w:t>대기 → 조회중 → 완료/실패 → 차이 검토 필요</w:t>
+            <w:r>
+              <w:t>대기 → 조회중 → 실패/완료 → 동일/차이 검토 필요</w:t>
             </w:r>
           </w:p>
         </w:tc>
@@ -3072,15 +2890,8 @@
               <w:spacing w:before="0" w:after="0" w:line="276" w:lineRule="auto"/>
               <w:jc w:val="left"/>
             </w:pPr>
-            <w:r/>
-            <w:r>
-              <w:rPr>
-                <w:rFonts w:ascii="Apple SD Gothic Neo" w:hAnsi="Apple SD Gothic Neo" w:eastAsia="Apple SD Gothic Neo"/>
-                <w:b w:val="0"/>
-                <w:color w:val="16243A"/>
-                <w:sz w:val="18"/>
-              </w:rPr>
-              <w:t>조회 실패 시 해당 국가 생성을 차단하고 차이만으로 문서를 자동 수정하지 않음</w:t>
+            <w:r>
+              <w:t>조회 실패 또는 차이 검토 필요 상태에서는 해당 국가의 신규 생성·재생성을 차단하고 현재 발행본을 유지</w:t>
             </w:r>
           </w:p>
         </w:tc>
@@ -3105,14 +2916,75 @@
               <w:spacing w:before="0" w:after="0" w:line="276" w:lineRule="auto"/>
               <w:jc w:val="left"/>
             </w:pPr>
-            <w:r/>
-            <w:r>
-              <w:rPr>
-                <w:rFonts w:ascii="Apple SD Gothic Neo" w:hAnsi="Apple SD Gothic Neo" w:eastAsia="Apple SD Gothic Neo"/>
-                <w:b/>
-                <w:color w:val="16243A"/>
-                <w:sz w:val="18"/>
-              </w:rPr>
+            <w:r>
+              <w:t>규칙·조항</w:t>
+            </w:r>
+          </w:p>
+        </w:tc>
+        <w:tc>
+          <w:tcPr>
+            <w:tcW w:type="dxa" w:w="3710"/>
+            <w:tcMar>
+              <w:top w:w="80" w:type="dxa"/>
+              <w:start w:w="120" w:type="dxa"/>
+              <w:bottom w:w="80" w:type="dxa"/>
+              <w:end w:w="120" w:type="dxa"/>
+            </w:tcMar>
+            <w:vAlign w:val="center"/>
+          </w:tcPr>
+          <w:p>
+            <w:pPr>
+              <w:spacing w:before="0" w:after="0" w:line="276" w:lineRule="auto"/>
+              <w:jc w:val="left"/>
+            </w:pPr>
+            <w:r>
+              <w:t>초안 → 검토중 → 반려/승인 → 활성 → 대체</w:t>
+            </w:r>
+          </w:p>
+        </w:tc>
+        <w:tc>
+          <w:tcPr>
+            <w:tcW w:type="dxa" w:w="4150"/>
+            <w:tcMar>
+              <w:top w:w="80" w:type="dxa"/>
+              <w:start w:w="120" w:type="dxa"/>
+              <w:bottom w:w="80" w:type="dxa"/>
+              <w:end w:w="120" w:type="dxa"/>
+            </w:tcMar>
+            <w:vAlign w:val="center"/>
+          </w:tcPr>
+          <w:p>
+            <w:pPr>
+              <w:spacing w:before="0" w:after="0" w:line="276" w:lineRule="auto"/>
+              <w:jc w:val="left"/>
+            </w:pPr>
+            <w:r>
+              <w:t>법률 검토 후 승인·활성화된 버전만 생성에 사용하며 출처 변화만으로 자동 수정·활성화하지 않음</w:t>
+            </w:r>
+          </w:p>
+        </w:tc>
+      </w:tr>
+      <w:tr>
+        <w:trPr>
+          <w:cantSplit/>
+        </w:trPr>
+        <w:tc>
+          <w:tcPr>
+            <w:tcW w:type="dxa" w:w="1500"/>
+            <w:tcMar>
+              <w:top w:w="80" w:type="dxa"/>
+              <w:start w:w="120" w:type="dxa"/>
+              <w:bottom w:w="80" w:type="dxa"/>
+              <w:end w:w="120" w:type="dxa"/>
+            </w:tcMar>
+            <w:vAlign w:val="center"/>
+          </w:tcPr>
+          <w:p>
+            <w:pPr>
+              <w:spacing w:before="0" w:after="0" w:line="276" w:lineRule="auto"/>
+              <w:jc w:val="left"/>
+            </w:pPr>
+            <w:r>
               <w:t>삭제</w:t>
             </w:r>
           </w:p>
@@ -3133,14 +3005,7 @@
               <w:spacing w:before="0" w:after="0" w:line="276" w:lineRule="auto"/>
               <w:jc w:val="left"/>
             </w:pPr>
-            <w:r/>
-            <w:r>
-              <w:rPr>
-                <w:rFonts w:ascii="Apple SD Gothic Neo" w:hAnsi="Apple SD Gothic Neo" w:eastAsia="Apple SD Gothic Neo"/>
-                <w:b w:val="0"/>
-                <w:color w:val="16243A"/>
-                <w:sz w:val="18"/>
-              </w:rPr>
+            <w:r>
               <w:t>요청 → 유예/대기 → 실행중 → 부분 실패/완료 → 백업 만료</w:t>
             </w:r>
           </w:p>
@@ -3161,15 +3026,451 @@
               <w:spacing w:before="0" w:after="0" w:line="276" w:lineRule="auto"/>
               <w:jc w:val="left"/>
             </w:pPr>
-            <w:r/>
-            <w:r>
-              <w:rPr>
-                <w:rFonts w:ascii="Apple SD Gothic Neo" w:hAnsi="Apple SD Gothic Neo" w:eastAsia="Apple SD Gothic Neo"/>
-                <w:b w:val="0"/>
-                <w:color w:val="16243A"/>
-                <w:sz w:val="18"/>
-              </w:rPr>
-              <w:t>보존 예외와 최종 만료일을 분리 기록</w:t>
+            <w:r>
+              <w:t>보존 예외와 최종 만료일을 분리 기록하고 부분 실패를 재시도</w:t>
+            </w:r>
+          </w:p>
+        </w:tc>
+      </w:tr>
+    </w:tbl>
+    <w:p>
+      <w:pPr>
+        <w:pStyle w:val="Heading2"/>
+      </w:pPr>
+      <w:r>
+        <w:t>3.1 공식 출처와 법률 콘텐츠 승인 흐름</w:t>
+      </w:r>
+    </w:p>
+    <w:p>
+      <w:r>
+        <w:t>공식 출처 수집은 기술적 증거 확보이고, RuleSet·Clause 승인은 법률 검토 결과입니다. 두 상태를 분리해 새로 수집한 문구가 검토 없이 고객 문서에 반영되지 않도록 합니다.</w:t>
+      </w:r>
+    </w:p>
+    <w:tbl>
+      <w:tblPr>
+        <w:tblStyle w:val="TableGrid"/>
+        <w:tblW w:type="dxa" w:w="9360"/>
+        <w:jc w:val="left"/>
+        <w:tblLayout w:type="fixed"/>
+        <w:tblLook w:firstColumn="1" w:firstRow="1" w:lastColumn="0" w:lastRow="0" w:noHBand="0" w:noVBand="1" w:val="04A0"/>
+        <w:tblInd w:w="120" w:type="dxa"/>
+      </w:tblPr>
+      <w:tblGrid>
+        <w:gridCol w:w="1500"/>
+        <w:gridCol w:w="3710"/>
+        <w:gridCol w:w="4150"/>
+      </w:tblGrid>
+      <w:tr>
+        <w:trPr>
+          <w:tblHeader w:val="true"/>
+          <w:cantSplit/>
+        </w:trPr>
+        <w:tc>
+          <w:tcPr>
+            <w:tcW w:type="dxa" w:w="1500"/>
+            <w:shd w:fill="E8EEF9"/>
+            <w:tcMar>
+              <w:top w:w="80" w:type="dxa"/>
+              <w:start w:w="120" w:type="dxa"/>
+              <w:bottom w:w="80" w:type="dxa"/>
+              <w:end w:w="120" w:type="dxa"/>
+            </w:tcMar>
+            <w:vAlign w:val="center"/>
+          </w:tcPr>
+          <w:p>
+            <w:pPr>
+              <w:keepNext/>
+              <w:spacing w:before="0" w:after="0" w:line="276" w:lineRule="auto"/>
+              <w:jc w:val="left"/>
+            </w:pPr>
+            <w:r>
+              <w:t>단계</w:t>
+            </w:r>
+          </w:p>
+        </w:tc>
+        <w:tc>
+          <w:tcPr>
+            <w:tcW w:type="dxa" w:w="3710"/>
+            <w:shd w:fill="E8EEF9"/>
+            <w:tcMar>
+              <w:top w:w="80" w:type="dxa"/>
+              <w:start w:w="120" w:type="dxa"/>
+              <w:bottom w:w="80" w:type="dxa"/>
+              <w:end w:w="120" w:type="dxa"/>
+            </w:tcMar>
+            <w:vAlign w:val="center"/>
+          </w:tcPr>
+          <w:p>
+            <w:pPr>
+              <w:keepNext/>
+              <w:spacing w:before="0" w:after="0" w:line="276" w:lineRule="auto"/>
+              <w:jc w:val="left"/>
+            </w:pPr>
+            <w:r>
+              <w:t>시스템 처리</w:t>
+            </w:r>
+          </w:p>
+        </w:tc>
+        <w:tc>
+          <w:tcPr>
+            <w:tcW w:type="dxa" w:w="4150"/>
+            <w:shd w:fill="E8EEF9"/>
+            <w:tcMar>
+              <w:top w:w="80" w:type="dxa"/>
+              <w:start w:w="120" w:type="dxa"/>
+              <w:bottom w:w="80" w:type="dxa"/>
+              <w:end w:w="120" w:type="dxa"/>
+            </w:tcMar>
+            <w:vAlign w:val="center"/>
+          </w:tcPr>
+          <w:p>
+            <w:pPr>
+              <w:keepNext/>
+              <w:spacing w:before="0" w:after="0" w:line="276" w:lineRule="auto"/>
+              <w:jc w:val="left"/>
+            </w:pPr>
+            <w:r>
+              <w:t>게이트</w:t>
+            </w:r>
+          </w:p>
+        </w:tc>
+      </w:tr>
+      <w:tr>
+        <w:trPr>
+          <w:cantSplit/>
+        </w:trPr>
+        <w:tc>
+          <w:tcPr>
+            <w:tcW w:type="dxa" w:w="1500"/>
+            <w:tcMar>
+              <w:top w:w="80" w:type="dxa"/>
+              <w:start w:w="120" w:type="dxa"/>
+              <w:bottom w:w="80" w:type="dxa"/>
+              <w:end w:w="120" w:type="dxa"/>
+            </w:tcMar>
+            <w:vAlign w:val="center"/>
+          </w:tcPr>
+          <w:p>
+            <w:pPr>
+              <w:spacing w:before="0" w:after="0" w:line="276" w:lineRule="auto"/>
+              <w:jc w:val="left"/>
+            </w:pPr>
+            <w:r>
+              <w:t>1. 조회</w:t>
+            </w:r>
+          </w:p>
+        </w:tc>
+        <w:tc>
+          <w:tcPr>
+            <w:tcW w:type="dxa" w:w="3710"/>
+            <w:tcMar>
+              <w:top w:w="80" w:type="dxa"/>
+              <w:start w:w="120" w:type="dxa"/>
+              <w:bottom w:w="80" w:type="dxa"/>
+              <w:end w:w="120" w:type="dxa"/>
+            </w:tcMar>
+            <w:vAlign w:val="center"/>
+          </w:tcPr>
+          <w:p>
+            <w:pPr>
+              <w:spacing w:before="0" w:after="0" w:line="276" w:lineRule="auto"/>
+              <w:jc w:val="left"/>
+            </w:pPr>
+            <w:r>
+              <w:t>허용된 공식 출처를 조회해 URL·시각·해시·법률 기준일·이용조건 상태를 SourceSnapshot으로 저장</w:t>
+            </w:r>
+          </w:p>
+        </w:tc>
+        <w:tc>
+          <w:tcPr>
+            <w:tcW w:type="dxa" w:w="4150"/>
+            <w:tcMar>
+              <w:top w:w="80" w:type="dxa"/>
+              <w:start w:w="120" w:type="dxa"/>
+              <w:bottom w:w="80" w:type="dxa"/>
+              <w:end w:w="120" w:type="dxa"/>
+            </w:tcMar>
+            <w:vAlign w:val="center"/>
+          </w:tcPr>
+          <w:p>
+            <w:pPr>
+              <w:spacing w:before="0" w:after="0" w:line="276" w:lineRule="auto"/>
+              <w:jc w:val="left"/>
+            </w:pPr>
+            <w:r>
+              <w:t>조회·검증 실패 시 해당 국가 신규 생성·재생성 차단</w:t>
+            </w:r>
+          </w:p>
+        </w:tc>
+      </w:tr>
+      <w:tr>
+        <w:trPr>
+          <w:cantSplit/>
+        </w:trPr>
+        <w:tc>
+          <w:tcPr>
+            <w:tcW w:type="dxa" w:w="1500"/>
+            <w:tcMar>
+              <w:top w:w="80" w:type="dxa"/>
+              <w:start w:w="120" w:type="dxa"/>
+              <w:bottom w:w="80" w:type="dxa"/>
+              <w:end w:w="120" w:type="dxa"/>
+            </w:tcMar>
+            <w:vAlign w:val="center"/>
+          </w:tcPr>
+          <w:p>
+            <w:pPr>
+              <w:spacing w:before="0" w:after="0" w:line="276" w:lineRule="auto"/>
+              <w:jc w:val="left"/>
+            </w:pPr>
+            <w:r>
+              <w:t>2. 비교</w:t>
+            </w:r>
+          </w:p>
+        </w:tc>
+        <w:tc>
+          <w:tcPr>
+            <w:tcW w:type="dxa" w:w="3710"/>
+            <w:tcMar>
+              <w:top w:w="80" w:type="dxa"/>
+              <w:start w:w="120" w:type="dxa"/>
+              <w:bottom w:w="80" w:type="dxa"/>
+              <w:end w:w="120" w:type="dxa"/>
+            </w:tcMar>
+            <w:vAlign w:val="center"/>
+          </w:tcPr>
+          <w:p>
+            <w:pPr>
+              <w:spacing w:before="0" w:after="0" w:line="276" w:lineRule="auto"/>
+              <w:jc w:val="left"/>
+            </w:pPr>
+            <w:r>
+              <w:t>작성 시점 SourceSnapshot과 활성 RuleSet·Clause의 승인 근거 스냅샷 해시를 비교</w:t>
+            </w:r>
+          </w:p>
+        </w:tc>
+        <w:tc>
+          <w:tcPr>
+            <w:tcW w:type="dxa" w:w="4150"/>
+            <w:tcMar>
+              <w:top w:w="80" w:type="dxa"/>
+              <w:start w:w="120" w:type="dxa"/>
+              <w:bottom w:w="80" w:type="dxa"/>
+              <w:end w:w="120" w:type="dxa"/>
+            </w:tcMar>
+            <w:vAlign w:val="center"/>
+          </w:tcPr>
+          <w:p>
+            <w:pPr>
+              <w:spacing w:before="0" w:after="0" w:line="276" w:lineRule="auto"/>
+              <w:jc w:val="left"/>
+            </w:pPr>
+            <w:r>
+              <w:t>동일하면 활성 버전 사용 가능, 다르면 ChangeReview 생성</w:t>
+            </w:r>
+          </w:p>
+        </w:tc>
+      </w:tr>
+      <w:tr>
+        <w:trPr>
+          <w:cantSplit/>
+        </w:trPr>
+        <w:tc>
+          <w:tcPr>
+            <w:tcW w:type="dxa" w:w="1500"/>
+            <w:tcMar>
+              <w:top w:w="80" w:type="dxa"/>
+              <w:start w:w="120" w:type="dxa"/>
+              <w:bottom w:w="80" w:type="dxa"/>
+              <w:end w:w="120" w:type="dxa"/>
+            </w:tcMar>
+            <w:vAlign w:val="center"/>
+          </w:tcPr>
+          <w:p>
+            <w:pPr>
+              <w:spacing w:before="0" w:after="0" w:line="276" w:lineRule="auto"/>
+              <w:jc w:val="left"/>
+            </w:pPr>
+            <w:r>
+              <w:t>3. 사람 검토</w:t>
+            </w:r>
+          </w:p>
+        </w:tc>
+        <w:tc>
+          <w:tcPr>
+            <w:tcW w:type="dxa" w:w="3710"/>
+            <w:tcMar>
+              <w:top w:w="80" w:type="dxa"/>
+              <w:start w:w="120" w:type="dxa"/>
+              <w:bottom w:w="80" w:type="dxa"/>
+              <w:end w:w="120" w:type="dxa"/>
+            </w:tcMar>
+            <w:vAlign w:val="center"/>
+          </w:tcPr>
+          <w:p>
+            <w:pPr>
+              <w:spacing w:before="0" w:after="0" w:line="276" w:lineRule="auto"/>
+              <w:jc w:val="left"/>
+            </w:pPr>
+            <w:r>
+              <w:t>법률 검토자가 문구 변화의 의미·적용 조건·영향을 판단하고 근거를 기록</w:t>
+            </w:r>
+          </w:p>
+        </w:tc>
+        <w:tc>
+          <w:tcPr>
+            <w:tcW w:type="dxa" w:w="4150"/>
+            <w:tcMar>
+              <w:top w:w="80" w:type="dxa"/>
+              <w:start w:w="120" w:type="dxa"/>
+              <w:bottom w:w="80" w:type="dxa"/>
+              <w:end w:w="120" w:type="dxa"/>
+            </w:tcMar>
+            <w:vAlign w:val="center"/>
+          </w:tcPr>
+          <w:p>
+            <w:pPr>
+              <w:spacing w:before="0" w:after="0" w:line="276" w:lineRule="auto"/>
+              <w:jc w:val="left"/>
+            </w:pPr>
+            <w:r>
+              <w:t>판단 전에는 규칙·조항·고객 문서 자동 변경 금지</w:t>
+            </w:r>
+          </w:p>
+        </w:tc>
+      </w:tr>
+      <w:tr>
+        <w:trPr>
+          <w:cantSplit/>
+        </w:trPr>
+        <w:tc>
+          <w:tcPr>
+            <w:tcW w:type="dxa" w:w="1500"/>
+            <w:tcMar>
+              <w:top w:w="80" w:type="dxa"/>
+              <w:start w:w="120" w:type="dxa"/>
+              <w:bottom w:w="80" w:type="dxa"/>
+              <w:end w:w="120" w:type="dxa"/>
+            </w:tcMar>
+            <w:vAlign w:val="center"/>
+          </w:tcPr>
+          <w:p>
+            <w:pPr>
+              <w:spacing w:before="0" w:after="0" w:line="276" w:lineRule="auto"/>
+              <w:jc w:val="left"/>
+            </w:pPr>
+            <w:r>
+              <w:t>4. 승인·활성화</w:t>
+            </w:r>
+          </w:p>
+        </w:tc>
+        <w:tc>
+          <w:tcPr>
+            <w:tcW w:type="dxa" w:w="3710"/>
+            <w:tcMar>
+              <w:top w:w="80" w:type="dxa"/>
+              <w:start w:w="120" w:type="dxa"/>
+              <w:bottom w:w="80" w:type="dxa"/>
+              <w:end w:w="120" w:type="dxa"/>
+            </w:tcMar>
+            <w:vAlign w:val="center"/>
+          </w:tcPr>
+          <w:p>
+            <w:pPr>
+              <w:spacing w:before="0" w:after="0" w:line="276" w:lineRule="auto"/>
+              <w:jc w:val="left"/>
+            </w:pPr>
+            <w:r>
+              <w:t>필요한 경우 새 RuleSet·Clause 버전을 승인하고 활성화</w:t>
+            </w:r>
+          </w:p>
+        </w:tc>
+        <w:tc>
+          <w:tcPr>
+            <w:tcW w:type="dxa" w:w="4150"/>
+            <w:tcMar>
+              <w:top w:w="80" w:type="dxa"/>
+              <w:start w:w="120" w:type="dxa"/>
+              <w:bottom w:w="80" w:type="dxa"/>
+              <w:end w:w="120" w:type="dxa"/>
+            </w:tcMar>
+            <w:vAlign w:val="center"/>
+          </w:tcPr>
+          <w:p>
+            <w:pPr>
+              <w:spacing w:before="0" w:after="0" w:line="276" w:lineRule="auto"/>
+              <w:jc w:val="left"/>
+            </w:pPr>
+            <w:r>
+              <w:t>검토자·결정·기준일·근거 스냅샷이 없으면 활성화 금지</w:t>
+            </w:r>
+          </w:p>
+        </w:tc>
+      </w:tr>
+      <w:tr>
+        <w:trPr>
+          <w:cantSplit/>
+        </w:trPr>
+        <w:tc>
+          <w:tcPr>
+            <w:tcW w:type="dxa" w:w="1500"/>
+            <w:tcMar>
+              <w:top w:w="80" w:type="dxa"/>
+              <w:start w:w="120" w:type="dxa"/>
+              <w:bottom w:w="80" w:type="dxa"/>
+              <w:end w:w="120" w:type="dxa"/>
+            </w:tcMar>
+            <w:vAlign w:val="center"/>
+          </w:tcPr>
+          <w:p>
+            <w:pPr>
+              <w:spacing w:before="0" w:after="0" w:line="276" w:lineRule="auto"/>
+              <w:jc w:val="left"/>
+            </w:pPr>
+            <w:r>
+              <w:t>5. 새 초안</w:t>
+            </w:r>
+          </w:p>
+        </w:tc>
+        <w:tc>
+          <w:tcPr>
+            <w:tcW w:type="dxa" w:w="3710"/>
+            <w:tcMar>
+              <w:top w:w="80" w:type="dxa"/>
+              <w:start w:w="120" w:type="dxa"/>
+              <w:bottom w:w="80" w:type="dxa"/>
+              <w:end w:w="120" w:type="dxa"/>
+            </w:tcMar>
+            <w:vAlign w:val="center"/>
+          </w:tcPr>
+          <w:p>
+            <w:pPr>
+              <w:spacing w:before="0" w:after="0" w:line="276" w:lineRule="auto"/>
+              <w:jc w:val="left"/>
+            </w:pPr>
+            <w:r>
+              <w:t>확정 사실과 새 활성 버전으로 별도 DocumentVersion 생성</w:t>
+            </w:r>
+          </w:p>
+        </w:tc>
+        <w:tc>
+          <w:tcPr>
+            <w:tcW w:type="dxa" w:w="4150"/>
+            <w:tcMar>
+              <w:top w:w="80" w:type="dxa"/>
+              <w:start w:w="120" w:type="dxa"/>
+              <w:bottom w:w="80" w:type="dxa"/>
+              <w:end w:w="120" w:type="dxa"/>
+            </w:tcMar>
+            <w:vAlign w:val="center"/>
+          </w:tcPr>
+          <w:p>
+            <w:pPr>
+              <w:spacing w:before="0" w:after="0" w:line="276" w:lineRule="auto"/>
+              <w:jc w:val="left"/>
+            </w:pPr>
+            <w:r>
+              <w:t>고객 재승인 전까지 현재 공개 버전 유지</w:t>
             </w:r>
           </w:p>
         </w:tc>
@@ -3224,14 +3525,7 @@
               <w:spacing w:before="0" w:after="0" w:line="276" w:lineRule="auto"/>
               <w:jc w:val="left"/>
             </w:pPr>
-            <w:r/>
-            <w:r>
-              <w:rPr>
-                <w:rFonts w:ascii="Apple SD Gothic Neo" w:hAnsi="Apple SD Gothic Neo" w:eastAsia="Apple SD Gothic Neo"/>
-                <w:b/>
-                <w:color w:val="16243A"/>
-                <w:sz w:val="18"/>
-              </w:rPr>
+            <w:r>
               <w:t>영역</w:t>
             </w:r>
           </w:p>
@@ -3254,14 +3548,7 @@
               <w:spacing w:before="0" w:after="0" w:line="276" w:lineRule="auto"/>
               <w:jc w:val="left"/>
             </w:pPr>
-            <w:r/>
-            <w:r>
-              <w:rPr>
-                <w:rFonts w:ascii="Apple SD Gothic Neo" w:hAnsi="Apple SD Gothic Neo" w:eastAsia="Apple SD Gothic Neo"/>
-                <w:b/>
-                <w:color w:val="16243A"/>
-                <w:sz w:val="18"/>
-              </w:rPr>
+            <w:r>
               <w:t>요구사항</w:t>
             </w:r>
           </w:p>
@@ -3287,14 +3574,7 @@
               <w:spacing w:before="0" w:after="0" w:line="276" w:lineRule="auto"/>
               <w:jc w:val="left"/>
             </w:pPr>
-            <w:r/>
-            <w:r>
-              <w:rPr>
-                <w:rFonts w:ascii="Apple SD Gothic Neo" w:hAnsi="Apple SD Gothic Neo" w:eastAsia="Apple SD Gothic Neo"/>
-                <w:b w:val="0"/>
-                <w:color w:val="16243A"/>
-                <w:sz w:val="18"/>
-              </w:rPr>
+            <w:r>
               <w:t>보안</w:t>
             </w:r>
           </w:p>
@@ -3315,14 +3595,7 @@
               <w:spacing w:before="0" w:after="0" w:line="276" w:lineRule="auto"/>
               <w:jc w:val="left"/>
             </w:pPr>
-            <w:r/>
-            <w:r>
-              <w:rPr>
-                <w:rFonts w:ascii="Apple SD Gothic Neo" w:hAnsi="Apple SD Gothic Neo" w:eastAsia="Apple SD Gothic Neo"/>
-                <w:b w:val="0"/>
-                <w:color w:val="16243A"/>
-                <w:sz w:val="18"/>
-              </w:rPr>
+            <w:r>
               <w:t>전송·저장 암호화, 최소권한, 비밀관리, 업로드 격리, 악성코드 검사, 감사 가능한 관리자 접근</w:t>
             </w:r>
           </w:p>
@@ -3348,14 +3621,7 @@
               <w:spacing w:before="0" w:after="0" w:line="276" w:lineRule="auto"/>
               <w:jc w:val="left"/>
             </w:pPr>
-            <w:r/>
-            <w:r>
-              <w:rPr>
-                <w:rFonts w:ascii="Apple SD Gothic Neo" w:hAnsi="Apple SD Gothic Neo" w:eastAsia="Apple SD Gothic Neo"/>
-                <w:b w:val="0"/>
-                <w:color w:val="16243A"/>
-                <w:sz w:val="18"/>
-              </w:rPr>
+            <w:r>
               <w:t>프라이버시</w:t>
             </w:r>
           </w:p>
@@ -3376,15 +3642,8 @@
               <w:spacing w:before="0" w:after="0" w:line="276" w:lineRule="auto"/>
               <w:jc w:val="left"/>
             </w:pPr>
-            <w:r/>
-            <w:r>
-              <w:rPr>
-                <w:rFonts w:ascii="Apple SD Gothic Neo" w:hAnsi="Apple SD Gothic Neo" w:eastAsia="Apple SD Gothic Neo"/>
-                <w:b w:val="0"/>
-                <w:color w:val="16243A"/>
-                <w:sz w:val="18"/>
-              </w:rPr>
-              <w:t>데이터 최소화, 외부 AI 전송 전 차단, 공급업체·처리지역 명시, 원본·파생 데이터 보유기간 분리</w:t>
+            <w:r>
+              <w:t>데이터 최소화, 외부 AI 전송 전 실제 개인정보·비밀정보 차단, 원문 로그 금지, 공급업체·처리지역·학습 사용·보유·삭제 조건 승인</w:t>
             </w:r>
           </w:p>
         </w:tc>
@@ -3409,15 +3668,8 @@
               <w:spacing w:before="0" w:after="0" w:line="276" w:lineRule="auto"/>
               <w:jc w:val="left"/>
             </w:pPr>
-            <w:r/>
-            <w:r>
-              <w:rPr>
-                <w:rFonts w:ascii="Apple SD Gothic Neo" w:hAnsi="Apple SD Gothic Neo" w:eastAsia="Apple SD Gothic Neo"/>
-                <w:b w:val="0"/>
-                <w:color w:val="16243A"/>
-                <w:sz w:val="18"/>
-              </w:rPr>
-              <w:t>정확성</w:t>
+            <w:r>
+              <w:t>입력 안전검사 구현</w:t>
             </w:r>
           </w:p>
         </w:tc>
@@ -3437,15 +3689,8 @@
               <w:spacing w:before="0" w:after="0" w:line="276" w:lineRule="auto"/>
               <w:jc w:val="left"/>
             </w:pPr>
-            <w:r/>
-            <w:r>
-              <w:rPr>
-                <w:rFonts w:ascii="Apple SD Gothic Neo" w:hAnsi="Apple SD Gothic Neo" w:eastAsia="Apple SD Gothic Neo"/>
-                <w:b w:val="0"/>
-                <w:color w:val="16243A"/>
-                <w:sz w:val="18"/>
-              </w:rPr>
-              <w:t>후보 근거·신뢰도·추출 버전 표시, 규칙·조항 승인 게이트, 회귀 테스트와 사람 검토</w:t>
+            <w:r>
+              <w:t>통제된 환경의 규칙·정규표현식·비밀 탐지기를 조합하고 탐지기 버전을 기록. 차단 결과 우회 전송 금지, 위치·유형·마스킹된 근거만 제공</w:t>
             </w:r>
           </w:p>
         </w:tc>
@@ -3470,15 +3715,8 @@
               <w:spacing w:before="0" w:after="0" w:line="276" w:lineRule="auto"/>
               <w:jc w:val="left"/>
             </w:pPr>
-            <w:r/>
-            <w:r>
-              <w:rPr>
-                <w:rFonts w:ascii="Apple SD Gothic Neo" w:hAnsi="Apple SD Gothic Neo" w:eastAsia="Apple SD Gothic Neo"/>
-                <w:b w:val="0"/>
-                <w:color w:val="16243A"/>
-                <w:sz w:val="18"/>
-              </w:rPr>
-              <w:t>추적성</w:t>
+            <w:r>
+              <w:t>정확성</w:t>
             </w:r>
           </w:p>
         </w:tc>
@@ -3498,15 +3736,8 @@
               <w:spacing w:before="0" w:after="0" w:line="276" w:lineRule="auto"/>
               <w:jc w:val="left"/>
             </w:pPr>
-            <w:r/>
-            <w:r>
-              <w:rPr>
-                <w:rFonts w:ascii="Apple SD Gothic Neo" w:hAnsi="Apple SD Gothic Neo" w:eastAsia="Apple SD Gothic Neo"/>
-                <w:b w:val="0"/>
-                <w:color w:val="16243A"/>
-                <w:sz w:val="18"/>
-              </w:rPr>
-              <w:t>사실·작성 시점 출처 스냅샷→규칙→조항→문서 버전→고객 승인 연결</w:t>
+            <w:r>
+              <w:t>후보 근거·추출 버전 표시, SourceSnapshot 수집 상태와 RuleSet·Clause 승인·활성 상태 분리, 회귀 테스트와 사람 검토</w:t>
             </w:r>
           </w:p>
         </w:tc>
@@ -3531,15 +3762,8 @@
               <w:spacing w:before="0" w:after="0" w:line="276" w:lineRule="auto"/>
               <w:jc w:val="left"/>
             </w:pPr>
-            <w:r/>
-            <w:r>
-              <w:rPr>
-                <w:rFonts w:ascii="Apple SD Gothic Neo" w:hAnsi="Apple SD Gothic Neo" w:eastAsia="Apple SD Gothic Neo"/>
-                <w:b w:val="0"/>
-                <w:color w:val="16243A"/>
-                <w:sz w:val="18"/>
-              </w:rPr>
-              <w:t>가용성</w:t>
+            <w:r>
+              <w:t>추적성</w:t>
             </w:r>
           </w:p>
         </w:tc>
@@ -3559,15 +3783,8 @@
               <w:spacing w:before="0" w:after="0" w:line="276" w:lineRule="auto"/>
               <w:jc w:val="left"/>
             </w:pPr>
-            <w:r/>
-            <w:r>
-              <w:rPr>
-                <w:rFonts w:ascii="Apple SD Gothic Neo" w:hAnsi="Apple SD Gothic Neo" w:eastAsia="Apple SD Gothic Neo"/>
-                <w:b w:val="0"/>
-                <w:color w:val="16243A"/>
-                <w:sz w:val="18"/>
-              </w:rPr>
-              <w:t>분석·수집·발행 작업의 멱등성, 재시도, 부분 실패 상태, 작업 큐와 운영 경보</w:t>
+            <w:r>
+              <w:t>사실 리비전→출처 스냅샷→ChangeReview→활성 규칙·조항→문서 버전→고객 승인 연결</w:t>
             </w:r>
           </w:p>
         </w:tc>
@@ -3592,15 +3809,8 @@
               <w:spacing w:before="0" w:after="0" w:line="276" w:lineRule="auto"/>
               <w:jc w:val="left"/>
             </w:pPr>
-            <w:r/>
-            <w:r>
-              <w:rPr>
-                <w:rFonts w:ascii="Apple SD Gothic Neo" w:hAnsi="Apple SD Gothic Neo" w:eastAsia="Apple SD Gothic Neo"/>
-                <w:b w:val="0"/>
-                <w:color w:val="16243A"/>
-                <w:sz w:val="18"/>
-              </w:rPr>
-              <w:t>접근성</w:t>
+            <w:r>
+              <w:t>가용성</w:t>
             </w:r>
           </w:p>
         </w:tc>
@@ -3620,15 +3830,8 @@
               <w:spacing w:before="0" w:after="0" w:line="276" w:lineRule="auto"/>
               <w:jc w:val="left"/>
             </w:pPr>
-            <w:r/>
-            <w:r>
-              <w:rPr>
-                <w:rFonts w:ascii="Apple SD Gothic Neo" w:hAnsi="Apple SD Gothic Neo" w:eastAsia="Apple SD Gothic Neo"/>
-                <w:b w:val="0"/>
-                <w:color w:val="16243A"/>
-                <w:sz w:val="18"/>
-              </w:rPr>
-              <w:t>키보드 조작, 포커스 가시성, 상태 변경 알림, 색상 외 상태 표현, 의미 있는 제목·레이블</w:t>
+            <w:r>
+              <w:t>분석·수집·발행 작업의 멱등성, 재시도, 국가별 부분 실패 상태, 작업 ID·큐와 기본 운영 경보</w:t>
             </w:r>
           </w:p>
         </w:tc>
@@ -3653,15 +3856,8 @@
               <w:spacing w:before="0" w:after="0" w:line="276" w:lineRule="auto"/>
               <w:jc w:val="left"/>
             </w:pPr>
-            <w:r/>
-            <w:r>
-              <w:rPr>
-                <w:rFonts w:ascii="Apple SD Gothic Neo" w:hAnsi="Apple SD Gothic Neo" w:eastAsia="Apple SD Gothic Neo"/>
-                <w:b w:val="0"/>
-                <w:color w:val="16243A"/>
-                <w:sz w:val="18"/>
-              </w:rPr>
-              <w:t>반응형</w:t>
+            <w:r>
+              <w:t>접근성</w:t>
             </w:r>
           </w:p>
         </w:tc>
@@ -3681,15 +3877,8 @@
               <w:spacing w:before="0" w:after="0" w:line="276" w:lineRule="auto"/>
               <w:jc w:val="left"/>
             </w:pPr>
-            <w:r/>
-            <w:r>
-              <w:rPr>
-                <w:rFonts w:ascii="Apple SD Gothic Neo" w:hAnsi="Apple SD Gothic Neo" w:eastAsia="Apple SD Gothic Neo"/>
-                <w:b w:val="0"/>
-                <w:color w:val="16243A"/>
-                <w:sz w:val="18"/>
-              </w:rPr>
-              <w:t>모바일 하단 고정 CTA, 긴 표 카드 전환/가로 스크롤 안내, 가로 넘침 방지</w:t>
+            <w:r>
+              <w:t>키보드 조작, 포커스 가시성, 상태 변경 알림, 색상 외 상태 표현, 의미 있는 제목·레이블</w:t>
             </w:r>
           </w:p>
         </w:tc>
@@ -3714,15 +3903,8 @@
               <w:spacing w:before="0" w:after="0" w:line="276" w:lineRule="auto"/>
               <w:jc w:val="left"/>
             </w:pPr>
-            <w:r/>
-            <w:r>
-              <w:rPr>
-                <w:rFonts w:ascii="Apple SD Gothic Neo" w:hAnsi="Apple SD Gothic Neo" w:eastAsia="Apple SD Gothic Neo"/>
-                <w:b w:val="0"/>
-                <w:color w:val="16243A"/>
-                <w:sz w:val="18"/>
-              </w:rPr>
-              <w:t>관찰성</w:t>
+            <w:r>
+              <w:t>반응형</w:t>
             </w:r>
           </w:p>
         </w:tc>
@@ -3742,15 +3924,8 @@
               <w:spacing w:before="0" w:after="0" w:line="276" w:lineRule="auto"/>
               <w:jc w:val="left"/>
             </w:pPr>
-            <w:r/>
-            <w:r>
-              <w:rPr>
-                <w:rFonts w:ascii="Apple SD Gothic Neo" w:hAnsi="Apple SD Gothic Neo" w:eastAsia="Apple SD Gothic Neo"/>
-                <w:b w:val="0"/>
-                <w:color w:val="16243A"/>
-                <w:sz w:val="18"/>
-              </w:rPr>
-              <w:t>원문·개인정보를 제외한 구조화 로그, 지표·트레이스·작업 ID, 고객 영향 기반 경보</w:t>
+            <w:r>
+              <w:t>최소 360 CSS px, 모바일 CTA 가림 방지, 긴 표 카드 전환/가로 스크롤 안내, 의도하지 않은 가로 넘침 방지</w:t>
             </w:r>
           </w:p>
         </w:tc>
@@ -3775,14 +3950,54 @@
               <w:spacing w:before="0" w:after="0" w:line="276" w:lineRule="auto"/>
               <w:jc w:val="left"/>
             </w:pPr>
-            <w:r/>
-            <w:r>
-              <w:rPr>
-                <w:rFonts w:ascii="Apple SD Gothic Neo" w:hAnsi="Apple SD Gothic Neo" w:eastAsia="Apple SD Gothic Neo"/>
-                <w:b w:val="0"/>
-                <w:color w:val="16243A"/>
-                <w:sz w:val="18"/>
-              </w:rPr>
+            <w:r>
+              <w:t>관찰성</w:t>
+            </w:r>
+          </w:p>
+        </w:tc>
+        <w:tc>
+          <w:tcPr>
+            <w:tcW w:type="dxa" w:w="7660"/>
+            <w:tcMar>
+              <w:top w:w="80" w:type="dxa"/>
+              <w:start w:w="120" w:type="dxa"/>
+              <w:bottom w:w="80" w:type="dxa"/>
+              <w:end w:w="120" w:type="dxa"/>
+            </w:tcMar>
+            <w:vAlign w:val="center"/>
+          </w:tcPr>
+          <w:p>
+            <w:pPr>
+              <w:spacing w:before="0" w:after="0" w:line="276" w:lineRule="auto"/>
+              <w:jc w:val="left"/>
+            </w:pPr>
+            <w:r>
+              <w:t>원문·개인정보를 제외한 구조화 로그, 지표·트레이스·작업 ID·오류 코드, 고객 영향 기반 경보</w:t>
+            </w:r>
+          </w:p>
+        </w:tc>
+      </w:tr>
+      <w:tr>
+        <w:trPr>
+          <w:cantSplit/>
+        </w:trPr>
+        <w:tc>
+          <w:tcPr>
+            <w:tcW w:type="dxa" w:w="1700"/>
+            <w:tcMar>
+              <w:top w:w="80" w:type="dxa"/>
+              <w:start w:w="120" w:type="dxa"/>
+              <w:bottom w:w="80" w:type="dxa"/>
+              <w:end w:w="120" w:type="dxa"/>
+            </w:tcMar>
+            <w:vAlign w:val="center"/>
+          </w:tcPr>
+          <w:p>
+            <w:pPr>
+              <w:spacing w:before="0" w:after="0" w:line="276" w:lineRule="auto"/>
+              <w:jc w:val="left"/>
+            </w:pPr>
+            <w:r>
               <w:t>보존·삭제</w:t>
             </w:r>
           </w:p>
@@ -3803,15 +4018,519 @@
               <w:spacing w:before="0" w:after="0" w:line="276" w:lineRule="auto"/>
               <w:jc w:val="left"/>
             </w:pPr>
-            <w:r/>
-            <w:r>
-              <w:rPr>
-                <w:rFonts w:ascii="Apple SD Gothic Neo" w:hAnsi="Apple SD Gothic Neo" w:eastAsia="Apple SD Gothic Neo"/>
-                <w:b w:val="0"/>
-                <w:color w:val="16243A"/>
-                <w:sz w:val="18"/>
-              </w:rPr>
-              <w:t>원본·추출·문서·감사·백업별 정책, 삭제 증적과 법적 보존 예외 분리</w:t>
+            <w:r>
+              <w:t>원본·추출·문서·감사·검색·백업별 정책, 삭제 증적, 부분 실패 재시도와 법적 보존 예외 분리</w:t>
+            </w:r>
+          </w:p>
+        </w:tc>
+      </w:tr>
+    </w:tbl>
+    <w:p>
+      <w:pPr>
+        <w:pStyle w:val="Heading2"/>
+      </w:pPr>
+      <w:r>
+        <w:t>4.1 MVP 기술 선택 상태</w:t>
+      </w:r>
+    </w:p>
+    <w:p>
+      <w:r>
+        <w:t>아래 항목은 제품의 필수 책임과 특정 기술 제품 선택을 구분합니다. ‘필요’는 구현 능력이 필요하다는 뜻이며 공급업체나 제품이 확정되었다는 의미는 아닙니다.</w:t>
+      </w:r>
+    </w:p>
+    <w:tbl>
+      <w:tblPr>
+        <w:tblStyle w:val="TableGrid"/>
+        <w:tblW w:type="dxa" w:w="9360"/>
+        <w:jc w:val="left"/>
+        <w:tblLayout w:type="fixed"/>
+        <w:tblLook w:firstColumn="1" w:firstRow="1" w:lastColumn="0" w:lastRow="0" w:noHBand="0" w:noVBand="1" w:val="04A0"/>
+        <w:tblInd w:w="120" w:type="dxa"/>
+      </w:tblPr>
+      <w:tblGrid>
+        <w:gridCol w:w="1500"/>
+        <w:gridCol w:w="3710"/>
+        <w:gridCol w:w="4150"/>
+      </w:tblGrid>
+      <w:tr>
+        <w:trPr>
+          <w:tblHeader w:val="true"/>
+          <w:cantSplit/>
+        </w:trPr>
+        <w:tc>
+          <w:tcPr>
+            <w:tcW w:type="dxa" w:w="1500"/>
+            <w:shd w:fill="E8EEF9"/>
+            <w:tcMar>
+              <w:top w:w="80" w:type="dxa"/>
+              <w:start w:w="120" w:type="dxa"/>
+              <w:bottom w:w="80" w:type="dxa"/>
+              <w:end w:w="120" w:type="dxa"/>
+            </w:tcMar>
+            <w:vAlign w:val="center"/>
+          </w:tcPr>
+          <w:p>
+            <w:pPr>
+              <w:keepNext/>
+              <w:spacing w:before="0" w:after="0" w:line="276" w:lineRule="auto"/>
+              <w:jc w:val="left"/>
+            </w:pPr>
+            <w:r>
+              <w:t>결정 항목</w:t>
+            </w:r>
+          </w:p>
+        </w:tc>
+        <w:tc>
+          <w:tcPr>
+            <w:tcW w:type="dxa" w:w="3710"/>
+            <w:shd w:fill="E8EEF9"/>
+            <w:tcMar>
+              <w:top w:w="80" w:type="dxa"/>
+              <w:start w:w="120" w:type="dxa"/>
+              <w:bottom w:w="80" w:type="dxa"/>
+              <w:end w:w="120" w:type="dxa"/>
+            </w:tcMar>
+            <w:vAlign w:val="center"/>
+          </w:tcPr>
+          <w:p>
+            <w:pPr>
+              <w:keepNext/>
+              <w:spacing w:before="0" w:after="0" w:line="276" w:lineRule="auto"/>
+              <w:jc w:val="left"/>
+            </w:pPr>
+            <w:r>
+              <w:t>상태</w:t>
+            </w:r>
+          </w:p>
+        </w:tc>
+        <w:tc>
+          <w:tcPr>
+            <w:tcW w:type="dxa" w:w="4150"/>
+            <w:shd w:fill="E8EEF9"/>
+            <w:tcMar>
+              <w:top w:w="80" w:type="dxa"/>
+              <w:start w:w="120" w:type="dxa"/>
+              <w:bottom w:w="80" w:type="dxa"/>
+              <w:end w:w="120" w:type="dxa"/>
+            </w:tcMar>
+            <w:vAlign w:val="center"/>
+          </w:tcPr>
+          <w:p>
+            <w:pPr>
+              <w:keepNext/>
+              <w:spacing w:before="0" w:after="0" w:line="276" w:lineRule="auto"/>
+              <w:jc w:val="left"/>
+            </w:pPr>
+            <w:r>
+              <w:t>MVP 기준</w:t>
+            </w:r>
+          </w:p>
+        </w:tc>
+      </w:tr>
+      <w:tr>
+        <w:trPr>
+          <w:cantSplit/>
+        </w:trPr>
+        <w:tc>
+          <w:tcPr>
+            <w:tcW w:type="dxa" w:w="1500"/>
+            <w:tcMar>
+              <w:top w:w="80" w:type="dxa"/>
+              <w:start w:w="120" w:type="dxa"/>
+              <w:bottom w:w="80" w:type="dxa"/>
+              <w:end w:w="120" w:type="dxa"/>
+            </w:tcMar>
+            <w:vAlign w:val="center"/>
+          </w:tcPr>
+          <w:p>
+            <w:pPr>
+              <w:spacing w:before="0" w:after="0" w:line="276" w:lineRule="auto"/>
+              <w:jc w:val="left"/>
+            </w:pPr>
+            <w:r>
+              <w:t>애플리케이션 구조</w:t>
+            </w:r>
+          </w:p>
+        </w:tc>
+        <w:tc>
+          <w:tcPr>
+            <w:tcW w:type="dxa" w:w="3710"/>
+            <w:tcMar>
+              <w:top w:w="80" w:type="dxa"/>
+              <w:start w:w="120" w:type="dxa"/>
+              <w:bottom w:w="80" w:type="dxa"/>
+              <w:end w:w="120" w:type="dxa"/>
+            </w:tcMar>
+            <w:vAlign w:val="center"/>
+          </w:tcPr>
+          <w:p>
+            <w:pPr>
+              <w:spacing w:before="0" w:after="0" w:line="276" w:lineRule="auto"/>
+              <w:jc w:val="left"/>
+            </w:pPr>
+            <w:r>
+              <w:t>권장안</w:t>
+            </w:r>
+          </w:p>
+        </w:tc>
+        <w:tc>
+          <w:tcPr>
+            <w:tcW w:type="dxa" w:w="4150"/>
+            <w:tcMar>
+              <w:top w:w="80" w:type="dxa"/>
+              <w:start w:w="120" w:type="dxa"/>
+              <w:bottom w:w="80" w:type="dxa"/>
+              <w:end w:w="120" w:type="dxa"/>
+            </w:tcMar>
+            <w:vAlign w:val="center"/>
+          </w:tcPr>
+          <w:p>
+            <w:pPr>
+              <w:spacing w:before="0" w:after="0" w:line="276" w:lineRule="auto"/>
+              <w:jc w:val="left"/>
+            </w:pPr>
+            <w:r>
+              <w:t>초기에는 모듈형 모놀리스와 분리된 작업자로 구성하고 기능 ID 기준의 모듈 경계를 유지</w:t>
+            </w:r>
+          </w:p>
+        </w:tc>
+      </w:tr>
+      <w:tr>
+        <w:trPr>
+          <w:cantSplit/>
+        </w:trPr>
+        <w:tc>
+          <w:tcPr>
+            <w:tcW w:type="dxa" w:w="1500"/>
+            <w:tcMar>
+              <w:top w:w="80" w:type="dxa"/>
+              <w:start w:w="120" w:type="dxa"/>
+              <w:bottom w:w="80" w:type="dxa"/>
+              <w:end w:w="120" w:type="dxa"/>
+            </w:tcMar>
+            <w:vAlign w:val="center"/>
+          </w:tcPr>
+          <w:p>
+            <w:pPr>
+              <w:spacing w:before="0" w:after="0" w:line="276" w:lineRule="auto"/>
+              <w:jc w:val="left"/>
+            </w:pPr>
+            <w:r>
+              <w:t>관계형 데이터 저장소</w:t>
+            </w:r>
+          </w:p>
+        </w:tc>
+        <w:tc>
+          <w:tcPr>
+            <w:tcW w:type="dxa" w:w="3710"/>
+            <w:tcMar>
+              <w:top w:w="80" w:type="dxa"/>
+              <w:start w:w="120" w:type="dxa"/>
+              <w:bottom w:w="80" w:type="dxa"/>
+              <w:end w:w="120" w:type="dxa"/>
+            </w:tcMar>
+            <w:vAlign w:val="center"/>
+          </w:tcPr>
+          <w:p>
+            <w:pPr>
+              <w:spacing w:before="0" w:after="0" w:line="276" w:lineRule="auto"/>
+              <w:jc w:val="left"/>
+            </w:pPr>
+            <w:r>
+              <w:t>필요·제품 미정</w:t>
+            </w:r>
+          </w:p>
+        </w:tc>
+        <w:tc>
+          <w:tcPr>
+            <w:tcW w:type="dxa" w:w="4150"/>
+            <w:tcMar>
+              <w:top w:w="80" w:type="dxa"/>
+              <w:start w:w="120" w:type="dxa"/>
+              <w:bottom w:w="80" w:type="dxa"/>
+              <w:end w:w="120" w:type="dxa"/>
+            </w:tcMar>
+            <w:vAlign w:val="center"/>
+          </w:tcPr>
+          <w:p>
+            <w:pPr>
+              <w:spacing w:before="0" w:after="0" w:line="276" w:lineRule="auto"/>
+              <w:jc w:val="left"/>
+            </w:pPr>
+            <w:r>
+              <w:t>프로젝트·사실 리비전·규칙·문서·승인·감사 상태와 참조 무결성을 저장</w:t>
+            </w:r>
+          </w:p>
+        </w:tc>
+      </w:tr>
+      <w:tr>
+        <w:trPr>
+          <w:cantSplit/>
+        </w:trPr>
+        <w:tc>
+          <w:tcPr>
+            <w:tcW w:type="dxa" w:w="1500"/>
+            <w:tcMar>
+              <w:top w:w="80" w:type="dxa"/>
+              <w:start w:w="120" w:type="dxa"/>
+              <w:bottom w:w="80" w:type="dxa"/>
+              <w:end w:w="120" w:type="dxa"/>
+            </w:tcMar>
+            <w:vAlign w:val="center"/>
+          </w:tcPr>
+          <w:p>
+            <w:pPr>
+              <w:spacing w:before="0" w:after="0" w:line="276" w:lineRule="auto"/>
+              <w:jc w:val="left"/>
+            </w:pPr>
+            <w:r>
+              <w:t>암호화 객체 저장소</w:t>
+            </w:r>
+          </w:p>
+        </w:tc>
+        <w:tc>
+          <w:tcPr>
+            <w:tcW w:type="dxa" w:w="3710"/>
+            <w:tcMar>
+              <w:top w:w="80" w:type="dxa"/>
+              <w:start w:w="120" w:type="dxa"/>
+              <w:bottom w:w="80" w:type="dxa"/>
+              <w:end w:w="120" w:type="dxa"/>
+            </w:tcMar>
+            <w:vAlign w:val="center"/>
+          </w:tcPr>
+          <w:p>
+            <w:pPr>
+              <w:spacing w:before="0" w:after="0" w:line="276" w:lineRule="auto"/>
+              <w:jc w:val="left"/>
+            </w:pPr>
+            <w:r>
+              <w:t>필요·제품 미정</w:t>
+            </w:r>
+          </w:p>
+        </w:tc>
+        <w:tc>
+          <w:tcPr>
+            <w:tcW w:type="dxa" w:w="4150"/>
+            <w:tcMar>
+              <w:top w:w="80" w:type="dxa"/>
+              <w:start w:w="120" w:type="dxa"/>
+              <w:bottom w:w="80" w:type="dxa"/>
+              <w:end w:w="120" w:type="dxa"/>
+            </w:tcMar>
+            <w:vAlign w:val="center"/>
+          </w:tcPr>
+          <w:p>
+            <w:pPr>
+              <w:spacing w:before="0" w:after="0" w:line="276" w:lineRule="auto"/>
+              <w:jc w:val="left"/>
+            </w:pPr>
+            <w:r>
+              <w:t>업로드 파일·출처 스냅샷·생성 문서를 고객별로 분리하고 암호화·보존·삭제 상태를 관리</w:t>
+            </w:r>
+          </w:p>
+        </w:tc>
+      </w:tr>
+      <w:tr>
+        <w:trPr>
+          <w:cantSplit/>
+        </w:trPr>
+        <w:tc>
+          <w:tcPr>
+            <w:tcW w:type="dxa" w:w="1500"/>
+            <w:tcMar>
+              <w:top w:w="80" w:type="dxa"/>
+              <w:start w:w="120" w:type="dxa"/>
+              <w:bottom w:w="80" w:type="dxa"/>
+              <w:end w:w="120" w:type="dxa"/>
+            </w:tcMar>
+            <w:vAlign w:val="center"/>
+          </w:tcPr>
+          <w:p>
+            <w:pPr>
+              <w:spacing w:before="0" w:after="0" w:line="276" w:lineRule="auto"/>
+              <w:jc w:val="left"/>
+            </w:pPr>
+            <w:r>
+              <w:t>작업 큐</w:t>
+            </w:r>
+          </w:p>
+        </w:tc>
+        <w:tc>
+          <w:tcPr>
+            <w:tcW w:type="dxa" w:w="3710"/>
+            <w:tcMar>
+              <w:top w:w="80" w:type="dxa"/>
+              <w:start w:w="120" w:type="dxa"/>
+              <w:bottom w:w="80" w:type="dxa"/>
+              <w:end w:w="120" w:type="dxa"/>
+            </w:tcMar>
+            <w:vAlign w:val="center"/>
+          </w:tcPr>
+          <w:p>
+            <w:pPr>
+              <w:spacing w:before="0" w:after="0" w:line="276" w:lineRule="auto"/>
+              <w:jc w:val="left"/>
+            </w:pPr>
+            <w:r>
+              <w:t>필요·제품 미정</w:t>
+            </w:r>
+          </w:p>
+        </w:tc>
+        <w:tc>
+          <w:tcPr>
+            <w:tcW w:type="dxa" w:w="4150"/>
+            <w:tcMar>
+              <w:top w:w="80" w:type="dxa"/>
+              <w:start w:w="120" w:type="dxa"/>
+              <w:bottom w:w="80" w:type="dxa"/>
+              <w:end w:w="120" w:type="dxa"/>
+            </w:tcMar>
+            <w:vAlign w:val="center"/>
+          </w:tcPr>
+          <w:p>
+            <w:pPr>
+              <w:spacing w:before="0" w:after="0" w:line="276" w:lineRule="auto"/>
+              <w:jc w:val="left"/>
+            </w:pPr>
+            <w:r>
+              <w:t>분석·출처 조회·생성·발행 작업 ID, 멱등성, 재시도와 부분 실패를 지원</w:t>
+            </w:r>
+          </w:p>
+        </w:tc>
+      </w:tr>
+      <w:tr>
+        <w:trPr>
+          <w:cantSplit/>
+        </w:trPr>
+        <w:tc>
+          <w:tcPr>
+            <w:tcW w:type="dxa" w:w="1500"/>
+            <w:tcMar>
+              <w:top w:w="80" w:type="dxa"/>
+              <w:start w:w="120" w:type="dxa"/>
+              <w:bottom w:w="80" w:type="dxa"/>
+              <w:end w:w="120" w:type="dxa"/>
+            </w:tcMar>
+            <w:vAlign w:val="center"/>
+          </w:tcPr>
+          <w:p>
+            <w:pPr>
+              <w:spacing w:before="0" w:after="0" w:line="276" w:lineRule="auto"/>
+              <w:jc w:val="left"/>
+            </w:pPr>
+            <w:r>
+              <w:t>외부 AI</w:t>
+            </w:r>
+          </w:p>
+        </w:tc>
+        <w:tc>
+          <w:tcPr>
+            <w:tcW w:type="dxa" w:w="3710"/>
+            <w:tcMar>
+              <w:top w:w="80" w:type="dxa"/>
+              <w:start w:w="120" w:type="dxa"/>
+              <w:bottom w:w="80" w:type="dxa"/>
+              <w:end w:w="120" w:type="dxa"/>
+            </w:tcMar>
+            <w:vAlign w:val="center"/>
+          </w:tcPr>
+          <w:p>
+            <w:pPr>
+              <w:spacing w:before="0" w:after="0" w:line="276" w:lineRule="auto"/>
+              <w:jc w:val="left"/>
+            </w:pPr>
+            <w:r>
+              <w:t>착수 게이트</w:t>
+            </w:r>
+          </w:p>
+        </w:tc>
+        <w:tc>
+          <w:tcPr>
+            <w:tcW w:type="dxa" w:w="4150"/>
+            <w:tcMar>
+              <w:top w:w="80" w:type="dxa"/>
+              <w:start w:w="120" w:type="dxa"/>
+              <w:bottom w:w="80" w:type="dxa"/>
+              <w:end w:w="120" w:type="dxa"/>
+            </w:tcMar>
+            <w:vAlign w:val="center"/>
+          </w:tcPr>
+          <w:p>
+            <w:pPr>
+              <w:spacing w:before="0" w:after="0" w:line="276" w:lineRule="auto"/>
+              <w:jc w:val="left"/>
+            </w:pPr>
+            <w:r>
+              <w:t>공급업체·처리 지역·학습 사용·보유·삭제·DPA 승인 후 안전검사 통과 자료만 전송</w:t>
+            </w:r>
+          </w:p>
+        </w:tc>
+      </w:tr>
+      <w:tr>
+        <w:trPr>
+          <w:cantSplit/>
+        </w:trPr>
+        <w:tc>
+          <w:tcPr>
+            <w:tcW w:type="dxa" w:w="1500"/>
+            <w:tcMar>
+              <w:top w:w="80" w:type="dxa"/>
+              <w:start w:w="120" w:type="dxa"/>
+              <w:bottom w:w="80" w:type="dxa"/>
+              <w:end w:w="120" w:type="dxa"/>
+            </w:tcMar>
+            <w:vAlign w:val="center"/>
+          </w:tcPr>
+          <w:p>
+            <w:pPr>
+              <w:spacing w:before="0" w:after="0" w:line="276" w:lineRule="auto"/>
+              <w:jc w:val="left"/>
+            </w:pPr>
+            <w:r>
+              <w:t>Rule / Clause Store</w:t>
+            </w:r>
+          </w:p>
+        </w:tc>
+        <w:tc>
+          <w:tcPr>
+            <w:tcW w:type="dxa" w:w="3710"/>
+            <w:tcMar>
+              <w:top w:w="80" w:type="dxa"/>
+              <w:start w:w="120" w:type="dxa"/>
+              <w:bottom w:w="80" w:type="dxa"/>
+              <w:end w:w="120" w:type="dxa"/>
+            </w:tcMar>
+            <w:vAlign w:val="center"/>
+          </w:tcPr>
+          <w:p>
+            <w:pPr>
+              <w:spacing w:before="0" w:after="0" w:line="276" w:lineRule="auto"/>
+              <w:jc w:val="left"/>
+            </w:pPr>
+            <w:r>
+              <w:t>논리 구성요소</w:t>
+            </w:r>
+          </w:p>
+        </w:tc>
+        <w:tc>
+          <w:tcPr>
+            <w:tcW w:type="dxa" w:w="4150"/>
+            <w:tcMar>
+              <w:top w:w="80" w:type="dxa"/>
+              <w:start w:w="120" w:type="dxa"/>
+              <w:bottom w:w="80" w:type="dxa"/>
+              <w:end w:w="120" w:type="dxa"/>
+            </w:tcMar>
+            <w:vAlign w:val="center"/>
+          </w:tcPr>
+          <w:p>
+            <w:pPr>
+              <w:spacing w:before="0" w:after="0" w:line="276" w:lineRule="auto"/>
+              <w:jc w:val="left"/>
+            </w:pPr>
+            <w:r>
+              <w:t>초기에는 관계형 데이터 저장소 안의 권한 분리 스키마로 구현할 수 있으며 별도 데이터베이스를 필수로 하지 않음</w:t>
             </w:r>
           </w:p>
         </w:tc>
@@ -3831,250 +4550,78 @@
       </w:r>
     </w:p>
     <w:p>
-      <w:pPr>
-        <w:numPr>
-          <w:ilvl w:val="0"/>
-          <w:numId w:val="11"/>
-        </w:numPr>
-        <w:spacing w:after="100" w:line="300" w:lineRule="auto"/>
-        <w:ind w:left="540" w:hanging="271"/>
-      </w:pPr>
       <w:r>
-        <w:t>MVP 수용 여부는 핵심 기능정의서 5장 ‘핵심 수용 시나리오’를 기준으로 판단합니다. 이 절은 구현·테스트 참고사항이며 기능 범위를 추가하지 않습니다. 내용이 충돌하면 핵심 기능정의서를 우선합니다.</w:t>
+        <w:t>MVP 수용 여부는 핵심 기능정의서 5장 ‘핵심 수용 시나리오’와 ‘표준 수용 테스트 데이터’를 기준으로 판단합니다. 이 절은 구현·테스트 참고사항이며 기능 범위를 추가하지 않습니다. 내용이 충돌하면 핵심 기능정의서를 우선합니다.</w:t>
       </w:r>
     </w:p>
     <w:p>
-      <w:pPr>
-        <w:numPr>
-          <w:ilvl w:val="0"/>
-          <w:numId w:val="11"/>
-        </w:numPr>
-        <w:spacing w:after="100" w:line="300" w:lineRule="auto"/>
-        <w:ind w:left="540" w:hanging="271"/>
-      </w:pPr>
       <w:r>
-        <w:rPr>
-          <w:rFonts w:ascii="Apple SD Gothic Neo" w:hAnsi="Apple SD Gothic Neo" w:eastAsia="Apple SD Gothic Neo"/>
-          <w:color w:val="16243A"/>
-          <w:sz w:val="21"/>
-        </w:rPr>
-        <w:t>가입 필수 동의가 없으면 실제 고객 계정을 만들 수 없다.</w:t>
+        <w:t>SET-01 필수 동의와 세션 만료를 UI와 API에서 각각 검증한다.</w:t>
       </w:r>
     </w:p>
     <w:p>
-      <w:pPr>
-        <w:numPr>
-          <w:ilvl w:val="0"/>
-          <w:numId w:val="11"/>
-        </w:numPr>
-        <w:spacing w:after="100" w:line="300" w:lineRule="auto"/>
-        <w:ind w:left="540" w:hanging="271"/>
-      </w:pPr>
       <w:r>
-        <w:rPr>
-          <w:rFonts w:ascii="Apple SD Gothic Neo" w:hAnsi="Apple SD Gothic Neo" w:eastAsia="Apple SD Gothic Neo"/>
-          <w:color w:val="16243A"/>
-          <w:sz w:val="21"/>
-        </w:rPr>
-        <w:t>개인 예비창업자는 회사 정보가 확정되지 않아도 초안 생성까지 진행할 수 있고, 표시 주체 명칭·주소·연락처가 미확정이면 공개 발행이 차단된다.</w:t>
+        <w:t>SAFE-01은 정상 후보와 근거를 생성하고, PII-01·SECRET-01·MALWARE-01은 외부 AI 호출이 0회인 상태로 차단되어야 한다.</w:t>
       </w:r>
     </w:p>
     <w:p>
-      <w:pPr>
-        <w:numPr>
-          <w:ilvl w:val="0"/>
-          <w:numId w:val="11"/>
-        </w:numPr>
-        <w:spacing w:after="100" w:line="300" w:lineRule="auto"/>
-        <w:ind w:left="540" w:hanging="271"/>
-      </w:pPr>
       <w:r>
-        <w:rPr>
-          <w:rFonts w:ascii="Apple SD Gothic Neo" w:hAnsi="Apple SD Gothic Neo" w:eastAsia="Apple SD Gothic Neo"/>
-          <w:color w:val="16243A"/>
-          <w:sz w:val="21"/>
-        </w:rPr>
-        <w:t>SET-04 다섯 기준 중 하나라도 해당하면 일반 자동 생성·발행 경로를 차단하고 판정 근거와 관할별 외부 검토 행동을 표시한다.</w:t>
+        <w:t>사용자가 지정한 개별 URL 하나만 검사·분석하며 최상위 URL 변환, 하위 링크 탐색 또는 사이트 전체 크롤링을 실행하지 않는다.</w:t>
       </w:r>
     </w:p>
     <w:p>
-      <w:pPr>
-        <w:numPr>
-          <w:ilvl w:val="0"/>
-          <w:numId w:val="11"/>
-        </w:numPr>
-        <w:spacing w:after="100" w:line="300" w:lineRule="auto"/>
-        <w:ind w:left="540" w:hanging="271"/>
-      </w:pPr>
       <w:r>
-        <w:rPr>
-          <w:rFonts w:ascii="Apple SD Gothic Neo" w:hAnsi="Apple SD Gothic Neo" w:eastAsia="Apple SD Gothic Neo"/>
-          <w:color w:val="16243A"/>
-          <w:sz w:val="21"/>
-        </w:rPr>
-        <w:t>사용자가 지정한 개별 URL은 각각 안전검사 후 분석하며, 개인정보 후보가 있는 자료는 외부 AI로 전송되지 않고 사용자가 위치와 조치 방법을 확인할 수 있다.</w:t>
+        <w:t>CONFLICT-01은 값과 근거 위치를 표시하고 해결 전 사실 리비전 확정과 발행을 차단한다.</w:t>
       </w:r>
     </w:p>
     <w:p>
-      <w:pPr>
-        <w:numPr>
-          <w:ilvl w:val="0"/>
-          <w:numId w:val="11"/>
-        </w:numPr>
-        <w:spacing w:after="100" w:line="300" w:lineRule="auto"/>
-        <w:ind w:left="540" w:hanging="271"/>
-      </w:pPr>
       <w:r>
-        <w:rPr>
-          <w:rFonts w:ascii="Apple SD Gothic Neo" w:hAnsi="Apple SD Gothic Neo" w:eastAsia="Apple SD Gothic Neo"/>
-          <w:color w:val="16243A"/>
-          <w:sz w:val="21"/>
-        </w:rPr>
-        <w:t>후보 중 하나라도 미확인이면 국가별 초안 미리보기는 가능하지만 공개 발행은 불가하다.</w:t>
+        <w:t>RISK-01은 일반 자동 생성·발행 경로를 차단하고 판정 근거와 관할별 외부 검토 행동을 표시한다.</w:t>
       </w:r>
     </w:p>
     <w:p>
-      <w:pPr>
-        <w:numPr>
-          <w:ilvl w:val="0"/>
-          <w:numId w:val="11"/>
-        </w:numPr>
-        <w:spacing w:after="100" w:line="300" w:lineRule="auto"/>
-        <w:ind w:left="540" w:hanging="271"/>
-      </w:pPr>
       <w:r>
-        <w:rPr>
-          <w:rFonts w:ascii="Apple SD Gothic Neo" w:hAnsi="Apple SD Gothic Neo" w:eastAsia="Apple SD Gothic Neo"/>
-          <w:color w:val="16243A"/>
-          <w:sz w:val="21"/>
-        </w:rPr>
-        <w:t>국가별 초안 생성 요청 시 공식 법령·지침 공개본을 조회해 출처 URL·조회 시각·원문 해시·법률 기준일을 저장하고, 조회 실패 시 해당 국가 초안 생성을 차단한다.</w:t>
+        <w:t>SOURCE-FAIL-01은 해당 국가 신규 생성·재생성을 차단하고 현재 발행본을 유지한다.</w:t>
       </w:r>
     </w:p>
     <w:p>
-      <w:pPr>
-        <w:numPr>
-          <w:ilvl w:val="0"/>
-          <w:numId w:val="11"/>
-        </w:numPr>
-        <w:spacing w:after="100" w:line="300" w:lineRule="auto"/>
-        <w:ind w:left="540" w:hanging="271"/>
-      </w:pPr>
       <w:r>
-        <w:rPr>
-          <w:rFonts w:ascii="Apple SD Gothic Neo" w:hAnsi="Apple SD Gothic Neo" w:eastAsia="Apple SD Gothic Neo"/>
-          <w:color w:val="16243A"/>
-          <w:sz w:val="21"/>
-        </w:rPr>
-        <w:t>확정 사실과 작성 시점의 국가별 법령·공식 지침으로 사용자가 선택한 목표 국가의 초안만 만들고 출처·차이·생성 근거를 확인할 수 있다.</w:t>
+        <w:t>SOURCE-CHANGE-01은 ChangeReview를 만들고 새 RuleSet·Clause가 승인·활성화될 때까지 신규 생성·재생성과 자동 문서 변경을 막는다.</w:t>
       </w:r>
     </w:p>
     <w:p>
-      <w:pPr>
-        <w:numPr>
-          <w:ilvl w:val="0"/>
-          <w:numId w:val="11"/>
-        </w:numPr>
-        <w:spacing w:after="100" w:line="300" w:lineRule="auto"/>
-        <w:ind w:left="540" w:hanging="271"/>
-      </w:pPr>
       <w:r>
-        <w:rPr>
-          <w:rFonts w:ascii="Apple SD Gothic Neo" w:hAnsi="Apple SD Gothic Neo" w:eastAsia="Apple SD Gothic Neo"/>
-          <w:color w:val="16243A"/>
-          <w:sz w:val="21"/>
-        </w:rPr>
-        <w:t>차단 항목, 미승인 규칙 또는 고객 최종 승인 누락이 있으면 발행 API와 UI 모두 거부한다.</w:t>
+        <w:t>선택한 국가의 활성 RuleSet·Clause와 승인 근거 SourceSnapshot만 생성에 사용하며 검토되지 않은 새 스냅샷을 입력으로 사용하지 않는다.</w:t>
       </w:r>
     </w:p>
     <w:p>
-      <w:pPr>
-        <w:numPr>
-          <w:ilvl w:val="0"/>
-          <w:numId w:val="11"/>
-        </w:numPr>
-        <w:spacing w:after="100" w:line="300" w:lineRule="auto"/>
-        <w:ind w:left="540" w:hanging="271"/>
-      </w:pPr>
       <w:r>
-        <w:rPr>
-          <w:rFonts w:ascii="Apple SD Gothic Neo" w:hAnsi="Apple SD Gothic Neo" w:eastAsia="Apple SD Gothic Neo"/>
-          <w:color w:val="16243A"/>
-          <w:sz w:val="21"/>
-        </w:rPr>
-        <w:t>각 국가 문서는 독립 버전으로 발행되고 이전 버전·시행일·변경 이유를 비교할 수 있다.</w:t>
+        <w:t>APPROVAL-01과 다른 차단 항목은 UI와 API 발행을 모두 거부하고 해결 행동을 표시한다.</w:t>
       </w:r>
     </w:p>
     <w:p>
-      <w:pPr>
-        <w:numPr>
-          <w:ilvl w:val="0"/>
-          <w:numId w:val="11"/>
-        </w:numPr>
-        <w:spacing w:after="100" w:line="300" w:lineRule="auto"/>
-        <w:ind w:left="540" w:hanging="271"/>
-      </w:pPr>
       <w:r>
-        <w:rPr>
-          <w:rFonts w:ascii="Apple SD Gothic Neo" w:hAnsi="Apple SD Gothic Neo" w:eastAsia="Apple SD Gothic Neo"/>
-          <w:color w:val="16243A"/>
-          <w:sz w:val="21"/>
-        </w:rPr>
-        <w:t>공식 출처 문구가 달라져도 검토 대기열만 만들고 규칙·조항·고객 문서는 자동 변경하지 않는다.</w:t>
+        <w:t>동일 작업 요청을 반복해도 중복 사실 리비전·출처 스냅샷·문서 버전·발행본을 만들지 않는다.</w:t>
       </w:r>
     </w:p>
     <w:p>
-      <w:pPr>
-        <w:numPr>
-          <w:ilvl w:val="0"/>
-          <w:numId w:val="11"/>
-        </w:numPr>
-        <w:spacing w:after="100" w:line="300" w:lineRule="auto"/>
-        <w:ind w:left="540" w:hanging="271"/>
-      </w:pPr>
       <w:r>
-        <w:rPr>
-          <w:rFonts w:ascii="Apple SD Gothic Neo" w:hAnsi="Apple SD Gothic Neo" w:eastAsia="Apple SD Gothic Neo"/>
-          <w:color w:val="16243A"/>
-          <w:sz w:val="21"/>
-        </w:rPr>
-        <w:t>사람이 새 규칙·조항을 승인해도 고객 승인 전에는 현재 공개 문서가 유지된다.</w:t>
+        <w:t>국가별 부분 실패가 다른 국가의 성공 결과를 되돌리지 않으며 실패 작업만 재시도할 수 있다.</w:t>
       </w:r>
     </w:p>
     <w:p>
-      <w:pPr>
-        <w:numPr>
-          <w:ilvl w:val="0"/>
-          <w:numId w:val="11"/>
-        </w:numPr>
-        <w:spacing w:after="100" w:line="300" w:lineRule="auto"/>
-        <w:ind w:left="540" w:hanging="271"/>
-      </w:pPr>
       <w:r>
-        <w:rPr>
-          <w:rFonts w:ascii="Apple SD Gothic Neo" w:hAnsi="Apple SD Gothic Neo" w:eastAsia="Apple SD Gothic Neo"/>
-          <w:color w:val="16243A"/>
-          <w:sz w:val="21"/>
-        </w:rPr>
-        <w:t>프로젝트 삭제 요청 후 원본·파생 데이터·공개 URL·감사·백업 상태를 구분해 추적할 수 있다.</w:t>
+        <w:t>발행 문서의 핵심 조항에서 사실 리비전, 승인 스냅샷, ChangeReview, 활성 규칙·조항, 고객 승인까지 역추적한다.</w:t>
       </w:r>
     </w:p>
     <w:p>
-      <w:pPr>
-        <w:numPr>
-          <w:ilvl w:val="0"/>
-          <w:numId w:val="11"/>
-        </w:numPr>
-        <w:spacing w:after="100" w:line="300" w:lineRule="auto"/>
-        <w:ind w:left="540" w:hanging="271"/>
-      </w:pPr>
       <w:r>
-        <w:rPr>
-          <w:rFonts w:ascii="Apple SD Gothic Neo" w:hAnsi="Apple SD Gothic Neo" w:eastAsia="Apple SD Gothic Neo"/>
-          <w:color w:val="16243A"/>
-          <w:sz w:val="21"/>
-        </w:rPr>
-        <w:t>모바일과 키보드만으로 핵심 여정의 다음 행동을 완료할 수 있고 런타임 오류와 가로 넘침이 없다.</w:t>
+        <w:t>프로젝트 삭제 요청 후 원본·파생 데이터·문서·공개 URL·검색·감사·백업·보존 예외 상태를 구분해 추적한다.</w:t>
+      </w:r>
+    </w:p>
+    <w:p>
+      <w:r>
+        <w:t>최소 360 CSS px와 키보드만으로 핵심 여정을 완료하고 포커스·상태·오류를 인지할 수 있으며 런타임 오류와 의도하지 않은 가로 넘침이 없다.</w:t>
       </w:r>
     </w:p>
     <w:p>

</xml_diff>